<commit_message>
implements a simple progressbar
</commit_message>
<xml_diff>
--- a/docs/Evaluation/Evaluation-Bachelorarbeit-Konzept.docx
+++ b/docs/Evaluation/Evaluation-Bachelorarbeit-Konzept.docx
@@ -5,18 +5,38 @@
     <w:p>
       <w:pPr>
         <w:rPr>
-          <w:sz w:val="22"/>
-          <w:szCs w:val="22"/>
+          <w:rFonts w:ascii="Arial" w:hAnsi="Arial" w:cs="Arial"/>
+          <w:b/>
+          <w:bCs/>
+          <w:sz w:val="36"/>
+          <w:szCs w:val="36"/>
+          <w:u w:val="single"/>
           <w:lang w:val="de-CH"/>
         </w:rPr>
       </w:pPr>
       <w:r>
         <w:rPr>
-          <w:sz w:val="22"/>
-          <w:szCs w:val="22"/>
+          <w:rFonts w:ascii="Arial" w:hAnsi="Arial" w:cs="Arial"/>
+          <w:b/>
+          <w:bCs/>
+          <w:sz w:val="36"/>
+          <w:szCs w:val="36"/>
+          <w:u w:val="single"/>
           <w:lang w:val="de-CH"/>
         </w:rPr>
-        <w:t xml:space="preserve">Evaluation 2026 </w:t>
+        <w:t xml:space="preserve">Evaluation </w:t>
+      </w:r>
+      <w:r>
+        <w:rPr>
+          <w:rFonts w:ascii="Arial" w:hAnsi="Arial" w:cs="Arial"/>
+          <w:b/>
+          <w:bCs/>
+          <w:sz w:val="36"/>
+          <w:szCs w:val="36"/>
+          <w:u w:val="single"/>
+          <w:lang w:val="de-CH"/>
+        </w:rPr>
+        <w:t>VR-Museum</w:t>
       </w:r>
     </w:p>
     <w:tbl>
@@ -26,8 +46,1804 @@
         <w:tblLook w:val="04A0" w:firstRow="1" w:lastRow="0" w:firstColumn="1" w:lastColumn="0" w:noHBand="0" w:noVBand="1"/>
       </w:tblPr>
       <w:tblGrid>
-        <w:gridCol w:w="4673"/>
-        <w:gridCol w:w="4677"/>
+        <w:gridCol w:w="4674"/>
+        <w:gridCol w:w="935"/>
+        <w:gridCol w:w="935"/>
+        <w:gridCol w:w="935"/>
+        <w:gridCol w:w="935"/>
+        <w:gridCol w:w="936"/>
+      </w:tblGrid>
+      <w:tr>
+        <w:tc>
+          <w:tcPr>
+            <w:tcW w:w="4674" w:type="dxa"/>
+            <w:shd w:val="clear" w:color="auto" w:fill="156082" w:themeFill="accent1"/>
+          </w:tcPr>
+          <w:p>
+            <w:pPr>
+              <w:rPr>
+                <w:rFonts w:cs="Times New Roman"/>
+                <w:color w:val="FFFFFF" w:themeColor="background1"/>
+                <w:sz w:val="22"/>
+                <w:szCs w:val="22"/>
+                <w:lang w:val="de-CH"/>
+              </w:rPr>
+            </w:pPr>
+            <w:r>
+              <w:rPr>
+                <w:color w:val="FFFFFF" w:themeColor="background1"/>
+              </w:rPr>
+              <w:t>System Usability Scale (SUS)</w:t>
+            </w:r>
+          </w:p>
+        </w:tc>
+        <w:tc>
+          <w:tcPr>
+            <w:tcW w:w="935" w:type="dxa"/>
+            <w:shd w:val="clear" w:color="auto" w:fill="156082" w:themeFill="accent1"/>
+          </w:tcPr>
+          <w:p>
+            <w:pPr>
+              <w:jc w:val="center"/>
+              <w:rPr>
+                <w:rFonts w:cs="Times New Roman"/>
+                <w:color w:val="FFFFFF" w:themeColor="background1"/>
+                <w:sz w:val="22"/>
+                <w:szCs w:val="22"/>
+                <w:lang w:val="de-CH"/>
+              </w:rPr>
+            </w:pPr>
+            <w:r>
+              <w:rPr>
+                <w:rFonts w:cs="Times New Roman"/>
+                <w:color w:val="FFFFFF" w:themeColor="background1"/>
+                <w:sz w:val="22"/>
+                <w:szCs w:val="22"/>
+                <w:lang w:val="de-CH"/>
+              </w:rPr>
+              <w:t>1</w:t>
+            </w:r>
+          </w:p>
+        </w:tc>
+        <w:tc>
+          <w:tcPr>
+            <w:tcW w:w="935" w:type="dxa"/>
+            <w:shd w:val="clear" w:color="auto" w:fill="156082" w:themeFill="accent1"/>
+          </w:tcPr>
+          <w:p>
+            <w:pPr>
+              <w:jc w:val="center"/>
+              <w:rPr>
+                <w:rFonts w:cs="Times New Roman"/>
+                <w:color w:val="FFFFFF" w:themeColor="background1"/>
+                <w:sz w:val="22"/>
+                <w:szCs w:val="22"/>
+                <w:lang w:val="de-CH"/>
+              </w:rPr>
+            </w:pPr>
+            <w:r>
+              <w:rPr>
+                <w:rFonts w:cs="Times New Roman"/>
+                <w:color w:val="FFFFFF" w:themeColor="background1"/>
+                <w:sz w:val="22"/>
+                <w:szCs w:val="22"/>
+                <w:lang w:val="de-CH"/>
+              </w:rPr>
+              <w:t>2</w:t>
+            </w:r>
+          </w:p>
+        </w:tc>
+        <w:tc>
+          <w:tcPr>
+            <w:tcW w:w="935" w:type="dxa"/>
+            <w:shd w:val="clear" w:color="auto" w:fill="156082" w:themeFill="accent1"/>
+          </w:tcPr>
+          <w:p>
+            <w:pPr>
+              <w:jc w:val="center"/>
+              <w:rPr>
+                <w:rFonts w:cs="Times New Roman"/>
+                <w:color w:val="FFFFFF" w:themeColor="background1"/>
+                <w:sz w:val="22"/>
+                <w:szCs w:val="22"/>
+                <w:lang w:val="de-CH"/>
+              </w:rPr>
+            </w:pPr>
+            <w:r>
+              <w:rPr>
+                <w:rFonts w:cs="Times New Roman"/>
+                <w:color w:val="FFFFFF" w:themeColor="background1"/>
+                <w:sz w:val="22"/>
+                <w:szCs w:val="22"/>
+                <w:lang w:val="de-CH"/>
+              </w:rPr>
+              <w:t>3</w:t>
+            </w:r>
+          </w:p>
+        </w:tc>
+        <w:tc>
+          <w:tcPr>
+            <w:tcW w:w="935" w:type="dxa"/>
+            <w:shd w:val="clear" w:color="auto" w:fill="156082" w:themeFill="accent1"/>
+          </w:tcPr>
+          <w:p>
+            <w:pPr>
+              <w:jc w:val="center"/>
+              <w:rPr>
+                <w:rFonts w:cs="Times New Roman"/>
+                <w:color w:val="FFFFFF" w:themeColor="background1"/>
+                <w:sz w:val="22"/>
+                <w:szCs w:val="22"/>
+                <w:lang w:val="de-CH"/>
+              </w:rPr>
+            </w:pPr>
+            <w:r>
+              <w:rPr>
+                <w:rFonts w:cs="Times New Roman"/>
+                <w:color w:val="FFFFFF" w:themeColor="background1"/>
+                <w:sz w:val="22"/>
+                <w:szCs w:val="22"/>
+                <w:lang w:val="de-CH"/>
+              </w:rPr>
+              <w:t>4</w:t>
+            </w:r>
+          </w:p>
+        </w:tc>
+        <w:tc>
+          <w:tcPr>
+            <w:tcW w:w="936" w:type="dxa"/>
+            <w:shd w:val="clear" w:color="auto" w:fill="156082" w:themeFill="accent1"/>
+          </w:tcPr>
+          <w:p>
+            <w:pPr>
+              <w:jc w:val="center"/>
+              <w:rPr>
+                <w:rFonts w:cs="Times New Roman"/>
+                <w:color w:val="FFFFFF" w:themeColor="background1"/>
+                <w:sz w:val="22"/>
+                <w:szCs w:val="22"/>
+                <w:lang w:val="de-CH"/>
+              </w:rPr>
+            </w:pPr>
+            <w:r>
+              <w:rPr>
+                <w:rFonts w:cs="Times New Roman"/>
+                <w:color w:val="FFFFFF" w:themeColor="background1"/>
+                <w:sz w:val="22"/>
+                <w:szCs w:val="22"/>
+                <w:lang w:val="de-CH"/>
+              </w:rPr>
+              <w:t>5</w:t>
+            </w:r>
+          </w:p>
+        </w:tc>
+      </w:tr>
+      <w:tr>
+        <w:trPr>
+          <w:trHeight w:val="237"/>
+        </w:trPr>
+        <w:tc>
+          <w:tcPr>
+            <w:tcW w:w="4674" w:type="dxa"/>
+          </w:tcPr>
+          <w:p>
+            <w:pPr>
+              <w:rPr>
+                <w:rFonts w:cs="Times New Roman"/>
+                <w:b/>
+                <w:bCs/>
+                <w:color w:val="FFFFFF" w:themeColor="background1"/>
+                <w:sz w:val="22"/>
+                <w:szCs w:val="22"/>
+                <w:lang w:val="de-CH"/>
+              </w:rPr>
+            </w:pPr>
+            <w:r>
+              <w:rPr>
+                <w:lang w:val="de-CH"/>
+              </w:rPr>
+              <w:t>Ich würde dieses System gerne häufig nutzen.</w:t>
+            </w:r>
+          </w:p>
+        </w:tc>
+        <w:tc>
+          <w:tcPr>
+            <w:tcW w:w="935" w:type="dxa"/>
+          </w:tcPr>
+          <w:p>
+            <w:pPr>
+              <w:jc w:val="center"/>
+              <w:rPr>
+                <w:rFonts w:cs="Times New Roman"/>
+                <w:b/>
+                <w:bCs/>
+                <w:color w:val="FFFFFF" w:themeColor="background1"/>
+                <w:sz w:val="22"/>
+                <w:szCs w:val="22"/>
+                <w:lang w:val="de-CH"/>
+              </w:rPr>
+            </w:pPr>
+            <w:r>
+              <w:rPr>
+                <w:rFonts w:ascii="Segoe UI Symbol" w:hAnsi="Segoe UI Symbol" w:cs="Segoe UI Symbol"/>
+              </w:rPr>
+              <w:t>☐</w:t>
+            </w:r>
+          </w:p>
+        </w:tc>
+        <w:tc>
+          <w:tcPr>
+            <w:tcW w:w="935" w:type="dxa"/>
+          </w:tcPr>
+          <w:p>
+            <w:pPr>
+              <w:jc w:val="center"/>
+              <w:rPr>
+                <w:rFonts w:cs="Times New Roman"/>
+                <w:b/>
+                <w:bCs/>
+                <w:color w:val="FFFFFF" w:themeColor="background1"/>
+                <w:sz w:val="22"/>
+                <w:szCs w:val="22"/>
+                <w:lang w:val="de-CH"/>
+              </w:rPr>
+            </w:pPr>
+            <w:r>
+              <w:rPr>
+                <w:rFonts w:ascii="Segoe UI Symbol" w:hAnsi="Segoe UI Symbol" w:cs="Segoe UI Symbol"/>
+              </w:rPr>
+              <w:t>☐</w:t>
+            </w:r>
+          </w:p>
+        </w:tc>
+        <w:tc>
+          <w:tcPr>
+            <w:tcW w:w="935" w:type="dxa"/>
+          </w:tcPr>
+          <w:p>
+            <w:pPr>
+              <w:jc w:val="center"/>
+              <w:rPr>
+                <w:rFonts w:cs="Times New Roman"/>
+                <w:b/>
+                <w:bCs/>
+                <w:color w:val="FFFFFF" w:themeColor="background1"/>
+                <w:sz w:val="22"/>
+                <w:szCs w:val="22"/>
+                <w:lang w:val="de-CH"/>
+              </w:rPr>
+            </w:pPr>
+            <w:r>
+              <w:rPr>
+                <w:rFonts w:ascii="Segoe UI Symbol" w:hAnsi="Segoe UI Symbol" w:cs="Segoe UI Symbol"/>
+              </w:rPr>
+              <w:t>☐</w:t>
+            </w:r>
+          </w:p>
+        </w:tc>
+        <w:tc>
+          <w:tcPr>
+            <w:tcW w:w="935" w:type="dxa"/>
+          </w:tcPr>
+          <w:p>
+            <w:pPr>
+              <w:jc w:val="center"/>
+              <w:rPr>
+                <w:rFonts w:cs="Times New Roman"/>
+                <w:b/>
+                <w:bCs/>
+                <w:color w:val="FFFFFF" w:themeColor="background1"/>
+                <w:sz w:val="22"/>
+                <w:szCs w:val="22"/>
+                <w:lang w:val="de-CH"/>
+              </w:rPr>
+            </w:pPr>
+            <w:r>
+              <w:rPr>
+                <w:rFonts w:ascii="Segoe UI Symbol" w:hAnsi="Segoe UI Symbol" w:cs="Segoe UI Symbol"/>
+              </w:rPr>
+              <w:t>☐</w:t>
+            </w:r>
+          </w:p>
+        </w:tc>
+        <w:tc>
+          <w:tcPr>
+            <w:tcW w:w="936" w:type="dxa"/>
+          </w:tcPr>
+          <w:p>
+            <w:pPr>
+              <w:jc w:val="center"/>
+              <w:rPr>
+                <w:rFonts w:cs="Times New Roman"/>
+                <w:b/>
+                <w:bCs/>
+                <w:color w:val="FFFFFF" w:themeColor="background1"/>
+                <w:sz w:val="22"/>
+                <w:szCs w:val="22"/>
+                <w:lang w:val="de-CH"/>
+              </w:rPr>
+            </w:pPr>
+            <w:r>
+              <w:rPr>
+                <w:rFonts w:ascii="Segoe UI Symbol" w:hAnsi="Segoe UI Symbol" w:cs="Segoe UI Symbol"/>
+              </w:rPr>
+              <w:t>☐</w:t>
+            </w:r>
+          </w:p>
+        </w:tc>
+      </w:tr>
+      <w:tr>
+        <w:trPr>
+          <w:trHeight w:val="232"/>
+        </w:trPr>
+        <w:tc>
+          <w:tcPr>
+            <w:tcW w:w="4674" w:type="dxa"/>
+          </w:tcPr>
+          <w:p>
+            <w:pPr>
+              <w:rPr>
+                <w:rFonts w:cs="Times New Roman"/>
+                <w:b/>
+                <w:bCs/>
+                <w:color w:val="FFFFFF" w:themeColor="background1"/>
+                <w:sz w:val="22"/>
+                <w:szCs w:val="22"/>
+                <w:lang w:val="de-CH"/>
+              </w:rPr>
+            </w:pPr>
+            <w:r>
+              <w:rPr>
+                <w:lang w:val="de-CH"/>
+              </w:rPr>
+              <w:t>Ich fand das System unnötig kompliziert.</w:t>
+            </w:r>
+          </w:p>
+        </w:tc>
+        <w:tc>
+          <w:tcPr>
+            <w:tcW w:w="935" w:type="dxa"/>
+          </w:tcPr>
+          <w:p>
+            <w:pPr>
+              <w:jc w:val="center"/>
+              <w:rPr>
+                <w:rFonts w:cs="Times New Roman"/>
+                <w:b/>
+                <w:bCs/>
+                <w:color w:val="FFFFFF" w:themeColor="background1"/>
+                <w:sz w:val="22"/>
+                <w:szCs w:val="22"/>
+                <w:lang w:val="de-CH"/>
+              </w:rPr>
+            </w:pPr>
+            <w:r>
+              <w:rPr>
+                <w:rFonts w:ascii="Segoe UI Symbol" w:hAnsi="Segoe UI Symbol" w:cs="Segoe UI Symbol"/>
+              </w:rPr>
+              <w:t>☐</w:t>
+            </w:r>
+          </w:p>
+        </w:tc>
+        <w:tc>
+          <w:tcPr>
+            <w:tcW w:w="935" w:type="dxa"/>
+          </w:tcPr>
+          <w:p>
+            <w:pPr>
+              <w:jc w:val="center"/>
+              <w:rPr>
+                <w:rFonts w:cs="Times New Roman"/>
+                <w:b/>
+                <w:bCs/>
+                <w:color w:val="FFFFFF" w:themeColor="background1"/>
+                <w:sz w:val="22"/>
+                <w:szCs w:val="22"/>
+                <w:lang w:val="de-CH"/>
+              </w:rPr>
+            </w:pPr>
+            <w:r>
+              <w:rPr>
+                <w:rFonts w:ascii="Segoe UI Symbol" w:hAnsi="Segoe UI Symbol" w:cs="Segoe UI Symbol"/>
+              </w:rPr>
+              <w:t>☐</w:t>
+            </w:r>
+          </w:p>
+        </w:tc>
+        <w:tc>
+          <w:tcPr>
+            <w:tcW w:w="935" w:type="dxa"/>
+          </w:tcPr>
+          <w:p>
+            <w:pPr>
+              <w:jc w:val="center"/>
+              <w:rPr>
+                <w:rFonts w:cs="Times New Roman"/>
+                <w:b/>
+                <w:bCs/>
+                <w:color w:val="FFFFFF" w:themeColor="background1"/>
+                <w:sz w:val="22"/>
+                <w:szCs w:val="22"/>
+                <w:lang w:val="de-CH"/>
+              </w:rPr>
+            </w:pPr>
+            <w:r>
+              <w:rPr>
+                <w:rFonts w:ascii="Segoe UI Symbol" w:hAnsi="Segoe UI Symbol" w:cs="Segoe UI Symbol"/>
+              </w:rPr>
+              <w:t>☐</w:t>
+            </w:r>
+          </w:p>
+        </w:tc>
+        <w:tc>
+          <w:tcPr>
+            <w:tcW w:w="935" w:type="dxa"/>
+          </w:tcPr>
+          <w:p>
+            <w:pPr>
+              <w:jc w:val="center"/>
+              <w:rPr>
+                <w:rFonts w:cs="Times New Roman"/>
+                <w:b/>
+                <w:bCs/>
+                <w:color w:val="FFFFFF" w:themeColor="background1"/>
+                <w:sz w:val="22"/>
+                <w:szCs w:val="22"/>
+                <w:lang w:val="de-CH"/>
+              </w:rPr>
+            </w:pPr>
+            <w:r>
+              <w:rPr>
+                <w:rFonts w:ascii="Segoe UI Symbol" w:hAnsi="Segoe UI Symbol" w:cs="Segoe UI Symbol"/>
+              </w:rPr>
+              <w:t>☐</w:t>
+            </w:r>
+          </w:p>
+        </w:tc>
+        <w:tc>
+          <w:tcPr>
+            <w:tcW w:w="936" w:type="dxa"/>
+          </w:tcPr>
+          <w:p>
+            <w:pPr>
+              <w:jc w:val="center"/>
+              <w:rPr>
+                <w:rFonts w:cs="Times New Roman"/>
+                <w:b/>
+                <w:bCs/>
+                <w:color w:val="FFFFFF" w:themeColor="background1"/>
+                <w:sz w:val="22"/>
+                <w:szCs w:val="22"/>
+                <w:lang w:val="de-CH"/>
+              </w:rPr>
+            </w:pPr>
+            <w:r>
+              <w:rPr>
+                <w:rFonts w:ascii="Segoe UI Symbol" w:hAnsi="Segoe UI Symbol" w:cs="Segoe UI Symbol"/>
+              </w:rPr>
+              <w:t>☐</w:t>
+            </w:r>
+          </w:p>
+        </w:tc>
+      </w:tr>
+      <w:tr>
+        <w:trPr>
+          <w:trHeight w:val="232"/>
+        </w:trPr>
+        <w:tc>
+          <w:tcPr>
+            <w:tcW w:w="4674" w:type="dxa"/>
+          </w:tcPr>
+          <w:p>
+            <w:pPr>
+              <w:rPr>
+                <w:rFonts w:cs="Times New Roman"/>
+                <w:b/>
+                <w:bCs/>
+                <w:color w:val="FFFFFF" w:themeColor="background1"/>
+                <w:sz w:val="22"/>
+                <w:szCs w:val="22"/>
+                <w:lang w:val="de-CH"/>
+              </w:rPr>
+            </w:pPr>
+            <w:r>
+              <w:rPr>
+                <w:lang w:val="de-CH"/>
+              </w:rPr>
+              <w:t>Ich fand das System einfach zu bedienen.</w:t>
+            </w:r>
+          </w:p>
+        </w:tc>
+        <w:tc>
+          <w:tcPr>
+            <w:tcW w:w="935" w:type="dxa"/>
+          </w:tcPr>
+          <w:p>
+            <w:pPr>
+              <w:jc w:val="center"/>
+              <w:rPr>
+                <w:rFonts w:cs="Times New Roman"/>
+                <w:b/>
+                <w:bCs/>
+                <w:color w:val="FFFFFF" w:themeColor="background1"/>
+                <w:sz w:val="22"/>
+                <w:szCs w:val="22"/>
+                <w:lang w:val="de-CH"/>
+              </w:rPr>
+            </w:pPr>
+            <w:r>
+              <w:rPr>
+                <w:rFonts w:ascii="Segoe UI Symbol" w:hAnsi="Segoe UI Symbol" w:cs="Segoe UI Symbol"/>
+              </w:rPr>
+              <w:t>☐</w:t>
+            </w:r>
+          </w:p>
+        </w:tc>
+        <w:tc>
+          <w:tcPr>
+            <w:tcW w:w="935" w:type="dxa"/>
+          </w:tcPr>
+          <w:p>
+            <w:pPr>
+              <w:jc w:val="center"/>
+              <w:rPr>
+                <w:rFonts w:cs="Times New Roman"/>
+                <w:b/>
+                <w:bCs/>
+                <w:color w:val="FFFFFF" w:themeColor="background1"/>
+                <w:sz w:val="22"/>
+                <w:szCs w:val="22"/>
+                <w:lang w:val="de-CH"/>
+              </w:rPr>
+            </w:pPr>
+            <w:r>
+              <w:rPr>
+                <w:rFonts w:ascii="Segoe UI Symbol" w:hAnsi="Segoe UI Symbol" w:cs="Segoe UI Symbol"/>
+              </w:rPr>
+              <w:t>☐</w:t>
+            </w:r>
+          </w:p>
+        </w:tc>
+        <w:tc>
+          <w:tcPr>
+            <w:tcW w:w="935" w:type="dxa"/>
+          </w:tcPr>
+          <w:p>
+            <w:pPr>
+              <w:jc w:val="center"/>
+              <w:rPr>
+                <w:rFonts w:cs="Times New Roman"/>
+                <w:b/>
+                <w:bCs/>
+                <w:color w:val="FFFFFF" w:themeColor="background1"/>
+                <w:sz w:val="22"/>
+                <w:szCs w:val="22"/>
+                <w:lang w:val="de-CH"/>
+              </w:rPr>
+            </w:pPr>
+            <w:r>
+              <w:rPr>
+                <w:rFonts w:ascii="Segoe UI Symbol" w:hAnsi="Segoe UI Symbol" w:cs="Segoe UI Symbol"/>
+              </w:rPr>
+              <w:t>☐</w:t>
+            </w:r>
+          </w:p>
+        </w:tc>
+        <w:tc>
+          <w:tcPr>
+            <w:tcW w:w="935" w:type="dxa"/>
+          </w:tcPr>
+          <w:p>
+            <w:pPr>
+              <w:jc w:val="center"/>
+              <w:rPr>
+                <w:rFonts w:cs="Times New Roman"/>
+                <w:b/>
+                <w:bCs/>
+                <w:color w:val="FFFFFF" w:themeColor="background1"/>
+                <w:sz w:val="22"/>
+                <w:szCs w:val="22"/>
+                <w:lang w:val="de-CH"/>
+              </w:rPr>
+            </w:pPr>
+            <w:r>
+              <w:rPr>
+                <w:rFonts w:ascii="Segoe UI Symbol" w:hAnsi="Segoe UI Symbol" w:cs="Segoe UI Symbol"/>
+              </w:rPr>
+              <w:t>☐</w:t>
+            </w:r>
+          </w:p>
+        </w:tc>
+        <w:tc>
+          <w:tcPr>
+            <w:tcW w:w="936" w:type="dxa"/>
+          </w:tcPr>
+          <w:p>
+            <w:pPr>
+              <w:jc w:val="center"/>
+              <w:rPr>
+                <w:rFonts w:cs="Times New Roman"/>
+                <w:b/>
+                <w:bCs/>
+                <w:color w:val="FFFFFF" w:themeColor="background1"/>
+                <w:sz w:val="22"/>
+                <w:szCs w:val="22"/>
+                <w:lang w:val="de-CH"/>
+              </w:rPr>
+            </w:pPr>
+            <w:r>
+              <w:rPr>
+                <w:rFonts w:ascii="Segoe UI Symbol" w:hAnsi="Segoe UI Symbol" w:cs="Segoe UI Symbol"/>
+              </w:rPr>
+              <w:t>☐</w:t>
+            </w:r>
+          </w:p>
+        </w:tc>
+      </w:tr>
+      <w:tr>
+        <w:trPr>
+          <w:trHeight w:val="232"/>
+        </w:trPr>
+        <w:tc>
+          <w:tcPr>
+            <w:tcW w:w="4674" w:type="dxa"/>
+          </w:tcPr>
+          <w:p>
+            <w:pPr>
+              <w:rPr>
+                <w:rFonts w:cs="Times New Roman"/>
+                <w:b/>
+                <w:bCs/>
+                <w:color w:val="FFFFFF" w:themeColor="background1"/>
+                <w:sz w:val="22"/>
+                <w:szCs w:val="22"/>
+                <w:lang w:val="de-CH"/>
+              </w:rPr>
+            </w:pPr>
+            <w:r>
+              <w:rPr>
+                <w:lang w:val="de-CH"/>
+              </w:rPr>
+              <w:t>Ich denke, ich würde Unterstützung durch eine technisch versierte Person benötigen, um das System nutzen zu können.</w:t>
+            </w:r>
+          </w:p>
+        </w:tc>
+        <w:tc>
+          <w:tcPr>
+            <w:tcW w:w="935" w:type="dxa"/>
+          </w:tcPr>
+          <w:p>
+            <w:pPr>
+              <w:jc w:val="center"/>
+              <w:rPr>
+                <w:rFonts w:cs="Times New Roman"/>
+                <w:b/>
+                <w:bCs/>
+                <w:color w:val="FFFFFF" w:themeColor="background1"/>
+                <w:sz w:val="22"/>
+                <w:szCs w:val="22"/>
+                <w:lang w:val="de-CH"/>
+              </w:rPr>
+            </w:pPr>
+            <w:r>
+              <w:rPr>
+                <w:rFonts w:ascii="Segoe UI Symbol" w:hAnsi="Segoe UI Symbol" w:cs="Segoe UI Symbol"/>
+              </w:rPr>
+              <w:t>☐</w:t>
+            </w:r>
+          </w:p>
+        </w:tc>
+        <w:tc>
+          <w:tcPr>
+            <w:tcW w:w="935" w:type="dxa"/>
+          </w:tcPr>
+          <w:p>
+            <w:pPr>
+              <w:jc w:val="center"/>
+              <w:rPr>
+                <w:rFonts w:cs="Times New Roman"/>
+                <w:b/>
+                <w:bCs/>
+                <w:color w:val="FFFFFF" w:themeColor="background1"/>
+                <w:sz w:val="22"/>
+                <w:szCs w:val="22"/>
+                <w:lang w:val="de-CH"/>
+              </w:rPr>
+            </w:pPr>
+            <w:r>
+              <w:rPr>
+                <w:rFonts w:ascii="Segoe UI Symbol" w:hAnsi="Segoe UI Symbol" w:cs="Segoe UI Symbol"/>
+              </w:rPr>
+              <w:t>☐</w:t>
+            </w:r>
+          </w:p>
+        </w:tc>
+        <w:tc>
+          <w:tcPr>
+            <w:tcW w:w="935" w:type="dxa"/>
+          </w:tcPr>
+          <w:p>
+            <w:pPr>
+              <w:jc w:val="center"/>
+              <w:rPr>
+                <w:rFonts w:cs="Times New Roman"/>
+                <w:b/>
+                <w:bCs/>
+                <w:color w:val="FFFFFF" w:themeColor="background1"/>
+                <w:sz w:val="22"/>
+                <w:szCs w:val="22"/>
+                <w:lang w:val="de-CH"/>
+              </w:rPr>
+            </w:pPr>
+            <w:r>
+              <w:rPr>
+                <w:rFonts w:ascii="Segoe UI Symbol" w:hAnsi="Segoe UI Symbol" w:cs="Segoe UI Symbol"/>
+              </w:rPr>
+              <w:t>☐</w:t>
+            </w:r>
+          </w:p>
+        </w:tc>
+        <w:tc>
+          <w:tcPr>
+            <w:tcW w:w="935" w:type="dxa"/>
+          </w:tcPr>
+          <w:p>
+            <w:pPr>
+              <w:jc w:val="center"/>
+              <w:rPr>
+                <w:rFonts w:cs="Times New Roman"/>
+                <w:b/>
+                <w:bCs/>
+                <w:color w:val="FFFFFF" w:themeColor="background1"/>
+                <w:sz w:val="22"/>
+                <w:szCs w:val="22"/>
+                <w:lang w:val="de-CH"/>
+              </w:rPr>
+            </w:pPr>
+            <w:r>
+              <w:rPr>
+                <w:rFonts w:ascii="Segoe UI Symbol" w:hAnsi="Segoe UI Symbol" w:cs="Segoe UI Symbol"/>
+              </w:rPr>
+              <w:t>☐</w:t>
+            </w:r>
+          </w:p>
+        </w:tc>
+        <w:tc>
+          <w:tcPr>
+            <w:tcW w:w="936" w:type="dxa"/>
+          </w:tcPr>
+          <w:p>
+            <w:pPr>
+              <w:jc w:val="center"/>
+              <w:rPr>
+                <w:rFonts w:cs="Times New Roman"/>
+                <w:b/>
+                <w:bCs/>
+                <w:color w:val="FFFFFF" w:themeColor="background1"/>
+                <w:sz w:val="22"/>
+                <w:szCs w:val="22"/>
+                <w:lang w:val="de-CH"/>
+              </w:rPr>
+            </w:pPr>
+            <w:r>
+              <w:rPr>
+                <w:rFonts w:ascii="Segoe UI Symbol" w:hAnsi="Segoe UI Symbol" w:cs="Segoe UI Symbol"/>
+              </w:rPr>
+              <w:t>☐</w:t>
+            </w:r>
+          </w:p>
+        </w:tc>
+      </w:tr>
+      <w:tr>
+        <w:trPr>
+          <w:trHeight w:val="232"/>
+        </w:trPr>
+        <w:tc>
+          <w:tcPr>
+            <w:tcW w:w="4674" w:type="dxa"/>
+          </w:tcPr>
+          <w:p>
+            <w:pPr>
+              <w:rPr>
+                <w:rFonts w:cs="Times New Roman"/>
+                <w:b/>
+                <w:bCs/>
+                <w:color w:val="FFFFFF" w:themeColor="background1"/>
+                <w:sz w:val="22"/>
+                <w:szCs w:val="22"/>
+                <w:lang w:val="de-CH"/>
+              </w:rPr>
+            </w:pPr>
+            <w:r>
+              <w:rPr>
+                <w:lang w:val="de-CH"/>
+              </w:rPr>
+              <w:t>Ich fand, dass die verschiedenen Funktionen des Systems gut aufeinander abgestimmt waren.</w:t>
+            </w:r>
+          </w:p>
+        </w:tc>
+        <w:tc>
+          <w:tcPr>
+            <w:tcW w:w="935" w:type="dxa"/>
+          </w:tcPr>
+          <w:p>
+            <w:pPr>
+              <w:jc w:val="center"/>
+              <w:rPr>
+                <w:rFonts w:cs="Times New Roman"/>
+                <w:b/>
+                <w:bCs/>
+                <w:color w:val="FFFFFF" w:themeColor="background1"/>
+                <w:sz w:val="22"/>
+                <w:szCs w:val="22"/>
+                <w:lang w:val="de-CH"/>
+              </w:rPr>
+            </w:pPr>
+            <w:r>
+              <w:rPr>
+                <w:rFonts w:ascii="Segoe UI Symbol" w:hAnsi="Segoe UI Symbol" w:cs="Segoe UI Symbol"/>
+              </w:rPr>
+              <w:t>☐</w:t>
+            </w:r>
+          </w:p>
+        </w:tc>
+        <w:tc>
+          <w:tcPr>
+            <w:tcW w:w="935" w:type="dxa"/>
+          </w:tcPr>
+          <w:p>
+            <w:pPr>
+              <w:jc w:val="center"/>
+              <w:rPr>
+                <w:rFonts w:cs="Times New Roman"/>
+                <w:b/>
+                <w:bCs/>
+                <w:color w:val="FFFFFF" w:themeColor="background1"/>
+                <w:sz w:val="22"/>
+                <w:szCs w:val="22"/>
+                <w:lang w:val="de-CH"/>
+              </w:rPr>
+            </w:pPr>
+            <w:r>
+              <w:rPr>
+                <w:rFonts w:ascii="Segoe UI Symbol" w:hAnsi="Segoe UI Symbol" w:cs="Segoe UI Symbol"/>
+              </w:rPr>
+              <w:t>☐</w:t>
+            </w:r>
+          </w:p>
+        </w:tc>
+        <w:tc>
+          <w:tcPr>
+            <w:tcW w:w="935" w:type="dxa"/>
+          </w:tcPr>
+          <w:p>
+            <w:pPr>
+              <w:jc w:val="center"/>
+              <w:rPr>
+                <w:rFonts w:cs="Times New Roman"/>
+                <w:b/>
+                <w:bCs/>
+                <w:color w:val="FFFFFF" w:themeColor="background1"/>
+                <w:sz w:val="22"/>
+                <w:szCs w:val="22"/>
+                <w:lang w:val="de-CH"/>
+              </w:rPr>
+            </w:pPr>
+            <w:r>
+              <w:rPr>
+                <w:rFonts w:ascii="Segoe UI Symbol" w:hAnsi="Segoe UI Symbol" w:cs="Segoe UI Symbol"/>
+              </w:rPr>
+              <w:t>☐</w:t>
+            </w:r>
+          </w:p>
+        </w:tc>
+        <w:tc>
+          <w:tcPr>
+            <w:tcW w:w="935" w:type="dxa"/>
+          </w:tcPr>
+          <w:p>
+            <w:pPr>
+              <w:jc w:val="center"/>
+              <w:rPr>
+                <w:rFonts w:cs="Times New Roman"/>
+                <w:b/>
+                <w:bCs/>
+                <w:color w:val="FFFFFF" w:themeColor="background1"/>
+                <w:sz w:val="22"/>
+                <w:szCs w:val="22"/>
+                <w:lang w:val="de-CH"/>
+              </w:rPr>
+            </w:pPr>
+            <w:r>
+              <w:rPr>
+                <w:rFonts w:ascii="Segoe UI Symbol" w:hAnsi="Segoe UI Symbol" w:cs="Segoe UI Symbol"/>
+              </w:rPr>
+              <w:t>☐</w:t>
+            </w:r>
+          </w:p>
+        </w:tc>
+        <w:tc>
+          <w:tcPr>
+            <w:tcW w:w="936" w:type="dxa"/>
+          </w:tcPr>
+          <w:p>
+            <w:pPr>
+              <w:jc w:val="center"/>
+              <w:rPr>
+                <w:rFonts w:cs="Times New Roman"/>
+                <w:b/>
+                <w:bCs/>
+                <w:color w:val="FFFFFF" w:themeColor="background1"/>
+                <w:sz w:val="22"/>
+                <w:szCs w:val="22"/>
+                <w:lang w:val="de-CH"/>
+              </w:rPr>
+            </w:pPr>
+            <w:r>
+              <w:rPr>
+                <w:rFonts w:ascii="Segoe UI Symbol" w:hAnsi="Segoe UI Symbol" w:cs="Segoe UI Symbol"/>
+              </w:rPr>
+              <w:t>☐</w:t>
+            </w:r>
+          </w:p>
+        </w:tc>
+      </w:tr>
+      <w:tr>
+        <w:trPr>
+          <w:trHeight w:val="232"/>
+        </w:trPr>
+        <w:tc>
+          <w:tcPr>
+            <w:tcW w:w="4674" w:type="dxa"/>
+          </w:tcPr>
+          <w:p>
+            <w:pPr>
+              <w:rPr>
+                <w:rFonts w:cs="Times New Roman"/>
+                <w:b/>
+                <w:bCs/>
+                <w:color w:val="FFFFFF" w:themeColor="background1"/>
+                <w:sz w:val="22"/>
+                <w:szCs w:val="22"/>
+                <w:lang w:val="de-CH"/>
+              </w:rPr>
+            </w:pPr>
+            <w:r>
+              <w:rPr>
+                <w:lang w:val="de-CH"/>
+              </w:rPr>
+              <w:t>Ich fand, dass das System zu viele Unstimmigkeiten bzw. Inkonsistenzen aufwies.</w:t>
+            </w:r>
+          </w:p>
+        </w:tc>
+        <w:tc>
+          <w:tcPr>
+            <w:tcW w:w="935" w:type="dxa"/>
+          </w:tcPr>
+          <w:p>
+            <w:pPr>
+              <w:jc w:val="center"/>
+              <w:rPr>
+                <w:rFonts w:cs="Times New Roman"/>
+                <w:b/>
+                <w:bCs/>
+                <w:color w:val="FFFFFF" w:themeColor="background1"/>
+                <w:sz w:val="22"/>
+                <w:szCs w:val="22"/>
+                <w:lang w:val="de-CH"/>
+              </w:rPr>
+            </w:pPr>
+            <w:r>
+              <w:rPr>
+                <w:rFonts w:ascii="Segoe UI Symbol" w:hAnsi="Segoe UI Symbol" w:cs="Segoe UI Symbol"/>
+              </w:rPr>
+              <w:t>☐</w:t>
+            </w:r>
+          </w:p>
+        </w:tc>
+        <w:tc>
+          <w:tcPr>
+            <w:tcW w:w="935" w:type="dxa"/>
+          </w:tcPr>
+          <w:p>
+            <w:pPr>
+              <w:jc w:val="center"/>
+              <w:rPr>
+                <w:rFonts w:cs="Times New Roman"/>
+                <w:b/>
+                <w:bCs/>
+                <w:color w:val="FFFFFF" w:themeColor="background1"/>
+                <w:sz w:val="22"/>
+                <w:szCs w:val="22"/>
+                <w:lang w:val="de-CH"/>
+              </w:rPr>
+            </w:pPr>
+            <w:r>
+              <w:rPr>
+                <w:rFonts w:ascii="Segoe UI Symbol" w:hAnsi="Segoe UI Symbol" w:cs="Segoe UI Symbol"/>
+              </w:rPr>
+              <w:t>☐</w:t>
+            </w:r>
+          </w:p>
+        </w:tc>
+        <w:tc>
+          <w:tcPr>
+            <w:tcW w:w="935" w:type="dxa"/>
+          </w:tcPr>
+          <w:p>
+            <w:pPr>
+              <w:jc w:val="center"/>
+              <w:rPr>
+                <w:rFonts w:cs="Times New Roman"/>
+                <w:b/>
+                <w:bCs/>
+                <w:color w:val="FFFFFF" w:themeColor="background1"/>
+                <w:sz w:val="22"/>
+                <w:szCs w:val="22"/>
+                <w:lang w:val="de-CH"/>
+              </w:rPr>
+            </w:pPr>
+            <w:r>
+              <w:rPr>
+                <w:rFonts w:ascii="Segoe UI Symbol" w:hAnsi="Segoe UI Symbol" w:cs="Segoe UI Symbol"/>
+              </w:rPr>
+              <w:t>☐</w:t>
+            </w:r>
+          </w:p>
+        </w:tc>
+        <w:tc>
+          <w:tcPr>
+            <w:tcW w:w="935" w:type="dxa"/>
+          </w:tcPr>
+          <w:p>
+            <w:pPr>
+              <w:jc w:val="center"/>
+              <w:rPr>
+                <w:rFonts w:cs="Times New Roman"/>
+                <w:b/>
+                <w:bCs/>
+                <w:color w:val="FFFFFF" w:themeColor="background1"/>
+                <w:sz w:val="22"/>
+                <w:szCs w:val="22"/>
+                <w:lang w:val="de-CH"/>
+              </w:rPr>
+            </w:pPr>
+            <w:r>
+              <w:rPr>
+                <w:rFonts w:ascii="Segoe UI Symbol" w:hAnsi="Segoe UI Symbol" w:cs="Segoe UI Symbol"/>
+              </w:rPr>
+              <w:t>☐</w:t>
+            </w:r>
+          </w:p>
+        </w:tc>
+        <w:tc>
+          <w:tcPr>
+            <w:tcW w:w="936" w:type="dxa"/>
+          </w:tcPr>
+          <w:p>
+            <w:pPr>
+              <w:jc w:val="center"/>
+              <w:rPr>
+                <w:rFonts w:cs="Times New Roman"/>
+                <w:b/>
+                <w:bCs/>
+                <w:color w:val="FFFFFF" w:themeColor="background1"/>
+                <w:sz w:val="22"/>
+                <w:szCs w:val="22"/>
+                <w:lang w:val="de-CH"/>
+              </w:rPr>
+            </w:pPr>
+            <w:r>
+              <w:rPr>
+                <w:rFonts w:ascii="Segoe UI Symbol" w:hAnsi="Segoe UI Symbol" w:cs="Segoe UI Symbol"/>
+              </w:rPr>
+              <w:t>☐</w:t>
+            </w:r>
+          </w:p>
+        </w:tc>
+      </w:tr>
+      <w:tr>
+        <w:trPr>
+          <w:trHeight w:val="232"/>
+        </w:trPr>
+        <w:tc>
+          <w:tcPr>
+            <w:tcW w:w="4674" w:type="dxa"/>
+          </w:tcPr>
+          <w:p>
+            <w:pPr>
+              <w:rPr>
+                <w:rFonts w:cs="Times New Roman"/>
+                <w:b/>
+                <w:bCs/>
+                <w:color w:val="FFFFFF" w:themeColor="background1"/>
+                <w:sz w:val="22"/>
+                <w:szCs w:val="22"/>
+                <w:lang w:val="de-CH"/>
+              </w:rPr>
+            </w:pPr>
+            <w:r>
+              <w:rPr>
+                <w:lang w:val="de-CH"/>
+              </w:rPr>
+              <w:t>I</w:t>
+            </w:r>
+            <w:r>
+              <w:rPr>
+                <w:lang w:val="de-CH"/>
+              </w:rPr>
+              <w:t>ch denke, die meisten Personen würden den Umgang mit diesem System sehr schnell erlernen.</w:t>
+            </w:r>
+          </w:p>
+        </w:tc>
+        <w:tc>
+          <w:tcPr>
+            <w:tcW w:w="935" w:type="dxa"/>
+          </w:tcPr>
+          <w:p>
+            <w:pPr>
+              <w:jc w:val="center"/>
+              <w:rPr>
+                <w:rFonts w:cs="Times New Roman"/>
+                <w:b/>
+                <w:bCs/>
+                <w:color w:val="FFFFFF" w:themeColor="background1"/>
+                <w:sz w:val="22"/>
+                <w:szCs w:val="22"/>
+                <w:lang w:val="de-CH"/>
+              </w:rPr>
+            </w:pPr>
+            <w:r>
+              <w:rPr>
+                <w:rFonts w:ascii="Segoe UI Symbol" w:hAnsi="Segoe UI Symbol" w:cs="Segoe UI Symbol"/>
+              </w:rPr>
+              <w:t>☐</w:t>
+            </w:r>
+          </w:p>
+        </w:tc>
+        <w:tc>
+          <w:tcPr>
+            <w:tcW w:w="935" w:type="dxa"/>
+          </w:tcPr>
+          <w:p>
+            <w:pPr>
+              <w:jc w:val="center"/>
+              <w:rPr>
+                <w:rFonts w:cs="Times New Roman"/>
+                <w:b/>
+                <w:bCs/>
+                <w:color w:val="FFFFFF" w:themeColor="background1"/>
+                <w:sz w:val="22"/>
+                <w:szCs w:val="22"/>
+                <w:lang w:val="de-CH"/>
+              </w:rPr>
+            </w:pPr>
+            <w:r>
+              <w:rPr>
+                <w:rFonts w:ascii="Segoe UI Symbol" w:hAnsi="Segoe UI Symbol" w:cs="Segoe UI Symbol"/>
+              </w:rPr>
+              <w:t>☐</w:t>
+            </w:r>
+          </w:p>
+        </w:tc>
+        <w:tc>
+          <w:tcPr>
+            <w:tcW w:w="935" w:type="dxa"/>
+          </w:tcPr>
+          <w:p>
+            <w:pPr>
+              <w:jc w:val="center"/>
+              <w:rPr>
+                <w:rFonts w:cs="Times New Roman"/>
+                <w:b/>
+                <w:bCs/>
+                <w:color w:val="FFFFFF" w:themeColor="background1"/>
+                <w:sz w:val="22"/>
+                <w:szCs w:val="22"/>
+                <w:lang w:val="de-CH"/>
+              </w:rPr>
+            </w:pPr>
+            <w:r>
+              <w:rPr>
+                <w:rFonts w:ascii="Segoe UI Symbol" w:hAnsi="Segoe UI Symbol" w:cs="Segoe UI Symbol"/>
+              </w:rPr>
+              <w:t>☐</w:t>
+            </w:r>
+          </w:p>
+        </w:tc>
+        <w:tc>
+          <w:tcPr>
+            <w:tcW w:w="935" w:type="dxa"/>
+          </w:tcPr>
+          <w:p>
+            <w:pPr>
+              <w:jc w:val="center"/>
+              <w:rPr>
+                <w:rFonts w:cs="Times New Roman"/>
+                <w:b/>
+                <w:bCs/>
+                <w:color w:val="FFFFFF" w:themeColor="background1"/>
+                <w:sz w:val="22"/>
+                <w:szCs w:val="22"/>
+                <w:lang w:val="de-CH"/>
+              </w:rPr>
+            </w:pPr>
+            <w:r>
+              <w:rPr>
+                <w:rFonts w:ascii="Segoe UI Symbol" w:hAnsi="Segoe UI Symbol" w:cs="Segoe UI Symbol"/>
+              </w:rPr>
+              <w:t>☐</w:t>
+            </w:r>
+          </w:p>
+        </w:tc>
+        <w:tc>
+          <w:tcPr>
+            <w:tcW w:w="936" w:type="dxa"/>
+          </w:tcPr>
+          <w:p>
+            <w:pPr>
+              <w:jc w:val="center"/>
+              <w:rPr>
+                <w:rFonts w:cs="Times New Roman"/>
+                <w:b/>
+                <w:bCs/>
+                <w:color w:val="FFFFFF" w:themeColor="background1"/>
+                <w:sz w:val="22"/>
+                <w:szCs w:val="22"/>
+                <w:lang w:val="de-CH"/>
+              </w:rPr>
+            </w:pPr>
+            <w:r>
+              <w:rPr>
+                <w:rFonts w:ascii="Segoe UI Symbol" w:hAnsi="Segoe UI Symbol" w:cs="Segoe UI Symbol"/>
+              </w:rPr>
+              <w:t>☐</w:t>
+            </w:r>
+          </w:p>
+        </w:tc>
+      </w:tr>
+      <w:tr>
+        <w:trPr>
+          <w:trHeight w:val="232"/>
+        </w:trPr>
+        <w:tc>
+          <w:tcPr>
+            <w:tcW w:w="4674" w:type="dxa"/>
+          </w:tcPr>
+          <w:p>
+            <w:pPr>
+              <w:rPr>
+                <w:rFonts w:cs="Times New Roman"/>
+                <w:b/>
+                <w:bCs/>
+                <w:color w:val="FFFFFF" w:themeColor="background1"/>
+                <w:sz w:val="22"/>
+                <w:szCs w:val="22"/>
+                <w:lang w:val="de-CH"/>
+              </w:rPr>
+            </w:pPr>
+            <w:r>
+              <w:rPr>
+                <w:lang w:val="de-CH"/>
+              </w:rPr>
+              <w:t>Ich empfand das System als umständlich in der Benutzung.</w:t>
+            </w:r>
+          </w:p>
+        </w:tc>
+        <w:tc>
+          <w:tcPr>
+            <w:tcW w:w="935" w:type="dxa"/>
+          </w:tcPr>
+          <w:p>
+            <w:pPr>
+              <w:jc w:val="center"/>
+              <w:rPr>
+                <w:rFonts w:cs="Times New Roman"/>
+                <w:b/>
+                <w:bCs/>
+                <w:color w:val="FFFFFF" w:themeColor="background1"/>
+                <w:sz w:val="22"/>
+                <w:szCs w:val="22"/>
+                <w:lang w:val="de-CH"/>
+              </w:rPr>
+            </w:pPr>
+            <w:r>
+              <w:rPr>
+                <w:rFonts w:ascii="Segoe UI Symbol" w:hAnsi="Segoe UI Symbol" w:cs="Segoe UI Symbol"/>
+              </w:rPr>
+              <w:t>☐</w:t>
+            </w:r>
+          </w:p>
+        </w:tc>
+        <w:tc>
+          <w:tcPr>
+            <w:tcW w:w="935" w:type="dxa"/>
+          </w:tcPr>
+          <w:p>
+            <w:pPr>
+              <w:jc w:val="center"/>
+              <w:rPr>
+                <w:rFonts w:cs="Times New Roman"/>
+                <w:b/>
+                <w:bCs/>
+                <w:color w:val="FFFFFF" w:themeColor="background1"/>
+                <w:sz w:val="22"/>
+                <w:szCs w:val="22"/>
+                <w:lang w:val="de-CH"/>
+              </w:rPr>
+            </w:pPr>
+            <w:r>
+              <w:rPr>
+                <w:rFonts w:ascii="Segoe UI Symbol" w:hAnsi="Segoe UI Symbol" w:cs="Segoe UI Symbol"/>
+              </w:rPr>
+              <w:t>☐</w:t>
+            </w:r>
+          </w:p>
+        </w:tc>
+        <w:tc>
+          <w:tcPr>
+            <w:tcW w:w="935" w:type="dxa"/>
+          </w:tcPr>
+          <w:p>
+            <w:pPr>
+              <w:jc w:val="center"/>
+              <w:rPr>
+                <w:rFonts w:cs="Times New Roman"/>
+                <w:b/>
+                <w:bCs/>
+                <w:color w:val="FFFFFF" w:themeColor="background1"/>
+                <w:sz w:val="22"/>
+                <w:szCs w:val="22"/>
+                <w:lang w:val="de-CH"/>
+              </w:rPr>
+            </w:pPr>
+            <w:r>
+              <w:rPr>
+                <w:rFonts w:ascii="Segoe UI Symbol" w:hAnsi="Segoe UI Symbol" w:cs="Segoe UI Symbol"/>
+              </w:rPr>
+              <w:t>☐</w:t>
+            </w:r>
+          </w:p>
+        </w:tc>
+        <w:tc>
+          <w:tcPr>
+            <w:tcW w:w="935" w:type="dxa"/>
+          </w:tcPr>
+          <w:p>
+            <w:pPr>
+              <w:jc w:val="center"/>
+              <w:rPr>
+                <w:rFonts w:cs="Times New Roman"/>
+                <w:b/>
+                <w:bCs/>
+                <w:color w:val="FFFFFF" w:themeColor="background1"/>
+                <w:sz w:val="22"/>
+                <w:szCs w:val="22"/>
+                <w:lang w:val="de-CH"/>
+              </w:rPr>
+            </w:pPr>
+            <w:r>
+              <w:rPr>
+                <w:rFonts w:ascii="Segoe UI Symbol" w:hAnsi="Segoe UI Symbol" w:cs="Segoe UI Symbol"/>
+              </w:rPr>
+              <w:t>☐</w:t>
+            </w:r>
+          </w:p>
+        </w:tc>
+        <w:tc>
+          <w:tcPr>
+            <w:tcW w:w="936" w:type="dxa"/>
+          </w:tcPr>
+          <w:p>
+            <w:pPr>
+              <w:jc w:val="center"/>
+              <w:rPr>
+                <w:rFonts w:cs="Times New Roman"/>
+                <w:b/>
+                <w:bCs/>
+                <w:color w:val="FFFFFF" w:themeColor="background1"/>
+                <w:sz w:val="22"/>
+                <w:szCs w:val="22"/>
+                <w:lang w:val="de-CH"/>
+              </w:rPr>
+            </w:pPr>
+            <w:r>
+              <w:rPr>
+                <w:rFonts w:ascii="Segoe UI Symbol" w:hAnsi="Segoe UI Symbol" w:cs="Segoe UI Symbol"/>
+              </w:rPr>
+              <w:t>☐</w:t>
+            </w:r>
+          </w:p>
+        </w:tc>
+      </w:tr>
+      <w:tr>
+        <w:trPr>
+          <w:trHeight w:val="232"/>
+        </w:trPr>
+        <w:tc>
+          <w:tcPr>
+            <w:tcW w:w="4674" w:type="dxa"/>
+          </w:tcPr>
+          <w:p>
+            <w:pPr>
+              <w:rPr>
+                <w:rFonts w:cs="Times New Roman"/>
+                <w:b/>
+                <w:bCs/>
+                <w:color w:val="FFFFFF" w:themeColor="background1"/>
+                <w:sz w:val="22"/>
+                <w:szCs w:val="22"/>
+                <w:lang w:val="de-CH"/>
+              </w:rPr>
+            </w:pPr>
+            <w:r>
+              <w:rPr>
+                <w:lang w:val="de-CH"/>
+              </w:rPr>
+              <w:t>Ich</w:t>
+            </w:r>
+            <w:r>
+              <w:rPr>
+                <w:lang w:val="de-CH"/>
+              </w:rPr>
+              <w:t xml:space="preserve"> fühlte mich im Umgang mit dem System sicher.</w:t>
+            </w:r>
+          </w:p>
+        </w:tc>
+        <w:tc>
+          <w:tcPr>
+            <w:tcW w:w="935" w:type="dxa"/>
+          </w:tcPr>
+          <w:p>
+            <w:pPr>
+              <w:jc w:val="center"/>
+              <w:rPr>
+                <w:rFonts w:cs="Times New Roman"/>
+                <w:b/>
+                <w:bCs/>
+                <w:color w:val="FFFFFF" w:themeColor="background1"/>
+                <w:sz w:val="22"/>
+                <w:szCs w:val="22"/>
+                <w:lang w:val="de-CH"/>
+              </w:rPr>
+            </w:pPr>
+            <w:r>
+              <w:rPr>
+                <w:rFonts w:ascii="Segoe UI Symbol" w:hAnsi="Segoe UI Symbol" w:cs="Segoe UI Symbol"/>
+              </w:rPr>
+              <w:t>☐</w:t>
+            </w:r>
+          </w:p>
+        </w:tc>
+        <w:tc>
+          <w:tcPr>
+            <w:tcW w:w="935" w:type="dxa"/>
+          </w:tcPr>
+          <w:p>
+            <w:pPr>
+              <w:jc w:val="center"/>
+              <w:rPr>
+                <w:rFonts w:cs="Times New Roman"/>
+                <w:b/>
+                <w:bCs/>
+                <w:color w:val="FFFFFF" w:themeColor="background1"/>
+                <w:sz w:val="22"/>
+                <w:szCs w:val="22"/>
+                <w:lang w:val="de-CH"/>
+              </w:rPr>
+            </w:pPr>
+            <w:r>
+              <w:rPr>
+                <w:rFonts w:ascii="Segoe UI Symbol" w:hAnsi="Segoe UI Symbol" w:cs="Segoe UI Symbol"/>
+              </w:rPr>
+              <w:t>☐</w:t>
+            </w:r>
+          </w:p>
+        </w:tc>
+        <w:tc>
+          <w:tcPr>
+            <w:tcW w:w="935" w:type="dxa"/>
+          </w:tcPr>
+          <w:p>
+            <w:pPr>
+              <w:jc w:val="center"/>
+              <w:rPr>
+                <w:rFonts w:cs="Times New Roman"/>
+                <w:b/>
+                <w:bCs/>
+                <w:color w:val="FFFFFF" w:themeColor="background1"/>
+                <w:sz w:val="22"/>
+                <w:szCs w:val="22"/>
+                <w:lang w:val="de-CH"/>
+              </w:rPr>
+            </w:pPr>
+            <w:r>
+              <w:rPr>
+                <w:rFonts w:ascii="Segoe UI Symbol" w:hAnsi="Segoe UI Symbol" w:cs="Segoe UI Symbol"/>
+              </w:rPr>
+              <w:t>☐</w:t>
+            </w:r>
+          </w:p>
+        </w:tc>
+        <w:tc>
+          <w:tcPr>
+            <w:tcW w:w="935" w:type="dxa"/>
+          </w:tcPr>
+          <w:p>
+            <w:pPr>
+              <w:jc w:val="center"/>
+              <w:rPr>
+                <w:rFonts w:cs="Times New Roman"/>
+                <w:b/>
+                <w:bCs/>
+                <w:color w:val="FFFFFF" w:themeColor="background1"/>
+                <w:sz w:val="22"/>
+                <w:szCs w:val="22"/>
+                <w:lang w:val="de-CH"/>
+              </w:rPr>
+            </w:pPr>
+            <w:r>
+              <w:rPr>
+                <w:rFonts w:ascii="Segoe UI Symbol" w:hAnsi="Segoe UI Symbol" w:cs="Segoe UI Symbol"/>
+              </w:rPr>
+              <w:t>☐</w:t>
+            </w:r>
+          </w:p>
+        </w:tc>
+        <w:tc>
+          <w:tcPr>
+            <w:tcW w:w="936" w:type="dxa"/>
+          </w:tcPr>
+          <w:p>
+            <w:pPr>
+              <w:jc w:val="center"/>
+              <w:rPr>
+                <w:rFonts w:cs="Times New Roman"/>
+                <w:b/>
+                <w:bCs/>
+                <w:color w:val="FFFFFF" w:themeColor="background1"/>
+                <w:sz w:val="22"/>
+                <w:szCs w:val="22"/>
+                <w:lang w:val="de-CH"/>
+              </w:rPr>
+            </w:pPr>
+            <w:r>
+              <w:rPr>
+                <w:rFonts w:ascii="Segoe UI Symbol" w:hAnsi="Segoe UI Symbol" w:cs="Segoe UI Symbol"/>
+              </w:rPr>
+              <w:t>☐</w:t>
+            </w:r>
+          </w:p>
+        </w:tc>
+      </w:tr>
+      <w:tr>
+        <w:trPr>
+          <w:trHeight w:val="232"/>
+        </w:trPr>
+        <w:tc>
+          <w:tcPr>
+            <w:tcW w:w="4674" w:type="dxa"/>
+          </w:tcPr>
+          <w:p>
+            <w:pPr>
+              <w:rPr>
+                <w:lang w:val="de-CH"/>
+              </w:rPr>
+            </w:pPr>
+            <w:r>
+              <w:rPr>
+                <w:lang w:val="de-CH"/>
+              </w:rPr>
+              <w:t>Ich musste zunächst viele Dinge lernen, bevor ich das System effektiv nutzen konnte.</w:t>
+            </w:r>
+          </w:p>
+        </w:tc>
+        <w:tc>
+          <w:tcPr>
+            <w:tcW w:w="935" w:type="dxa"/>
+          </w:tcPr>
+          <w:p>
+            <w:pPr>
+              <w:jc w:val="center"/>
+              <w:rPr>
+                <w:rFonts w:cs="Times New Roman"/>
+                <w:b/>
+                <w:bCs/>
+                <w:color w:val="FFFFFF" w:themeColor="background1"/>
+                <w:sz w:val="22"/>
+                <w:szCs w:val="22"/>
+                <w:lang w:val="de-CH"/>
+              </w:rPr>
+            </w:pPr>
+            <w:r>
+              <w:rPr>
+                <w:rFonts w:ascii="Segoe UI Symbol" w:hAnsi="Segoe UI Symbol" w:cs="Segoe UI Symbol"/>
+              </w:rPr>
+              <w:t>☐</w:t>
+            </w:r>
+          </w:p>
+        </w:tc>
+        <w:tc>
+          <w:tcPr>
+            <w:tcW w:w="935" w:type="dxa"/>
+          </w:tcPr>
+          <w:p>
+            <w:pPr>
+              <w:jc w:val="center"/>
+              <w:rPr>
+                <w:rFonts w:cs="Times New Roman"/>
+                <w:b/>
+                <w:bCs/>
+                <w:color w:val="FFFFFF" w:themeColor="background1"/>
+                <w:sz w:val="22"/>
+                <w:szCs w:val="22"/>
+                <w:lang w:val="de-CH"/>
+              </w:rPr>
+            </w:pPr>
+            <w:r>
+              <w:rPr>
+                <w:rFonts w:ascii="Segoe UI Symbol" w:hAnsi="Segoe UI Symbol" w:cs="Segoe UI Symbol"/>
+              </w:rPr>
+              <w:t>☐</w:t>
+            </w:r>
+          </w:p>
+        </w:tc>
+        <w:tc>
+          <w:tcPr>
+            <w:tcW w:w="935" w:type="dxa"/>
+          </w:tcPr>
+          <w:p>
+            <w:pPr>
+              <w:jc w:val="center"/>
+              <w:rPr>
+                <w:rFonts w:cs="Times New Roman"/>
+                <w:b/>
+                <w:bCs/>
+                <w:color w:val="FFFFFF" w:themeColor="background1"/>
+                <w:sz w:val="22"/>
+                <w:szCs w:val="22"/>
+                <w:lang w:val="de-CH"/>
+              </w:rPr>
+            </w:pPr>
+            <w:r>
+              <w:rPr>
+                <w:rFonts w:ascii="Segoe UI Symbol" w:hAnsi="Segoe UI Symbol" w:cs="Segoe UI Symbol"/>
+              </w:rPr>
+              <w:t>☐</w:t>
+            </w:r>
+          </w:p>
+        </w:tc>
+        <w:tc>
+          <w:tcPr>
+            <w:tcW w:w="935" w:type="dxa"/>
+          </w:tcPr>
+          <w:p>
+            <w:pPr>
+              <w:jc w:val="center"/>
+              <w:rPr>
+                <w:rFonts w:cs="Times New Roman"/>
+                <w:b/>
+                <w:bCs/>
+                <w:color w:val="FFFFFF" w:themeColor="background1"/>
+                <w:sz w:val="22"/>
+                <w:szCs w:val="22"/>
+                <w:lang w:val="de-CH"/>
+              </w:rPr>
+            </w:pPr>
+            <w:r>
+              <w:rPr>
+                <w:rFonts w:ascii="Segoe UI Symbol" w:hAnsi="Segoe UI Symbol" w:cs="Segoe UI Symbol"/>
+              </w:rPr>
+              <w:t>☐</w:t>
+            </w:r>
+          </w:p>
+        </w:tc>
+        <w:tc>
+          <w:tcPr>
+            <w:tcW w:w="936" w:type="dxa"/>
+          </w:tcPr>
+          <w:p>
+            <w:pPr>
+              <w:jc w:val="center"/>
+              <w:rPr>
+                <w:rFonts w:cs="Times New Roman"/>
+                <w:b/>
+                <w:bCs/>
+                <w:color w:val="FFFFFF" w:themeColor="background1"/>
+                <w:sz w:val="22"/>
+                <w:szCs w:val="22"/>
+                <w:lang w:val="de-CH"/>
+              </w:rPr>
+            </w:pPr>
+            <w:r>
+              <w:rPr>
+                <w:rFonts w:ascii="Segoe UI Symbol" w:hAnsi="Segoe UI Symbol" w:cs="Segoe UI Symbol"/>
+              </w:rPr>
+              <w:t>☐</w:t>
+            </w:r>
+          </w:p>
+        </w:tc>
+      </w:tr>
+    </w:tbl>
+    <w:p>
+      <w:pPr>
+        <w:rPr>
+          <w:lang w:val="de-CH"/>
+        </w:rPr>
+      </w:pPr>
+    </w:p>
+    <w:p>
+      <w:pPr>
+        <w:rPr>
+          <w:lang w:val="de-CH"/>
+        </w:rPr>
+      </w:pPr>
+    </w:p>
+    <w:p>
+      <w:pPr>
+        <w:rPr>
+          <w:lang w:val="de-CH"/>
+        </w:rPr>
+      </w:pPr>
+    </w:p>
+    <w:p>
+      <w:pPr>
+        <w:rPr>
+          <w:lang w:val="de-CH"/>
+        </w:rPr>
+      </w:pPr>
+    </w:p>
+    <w:p>
+      <w:pPr>
+        <w:rPr>
+          <w:lang w:val="de-CH"/>
+        </w:rPr>
+      </w:pPr>
+    </w:p>
+    <w:p>
+      <w:pPr>
+        <w:rPr>
+          <w:lang w:val="de-CH"/>
+        </w:rPr>
+      </w:pPr>
+    </w:p>
+    <w:p>
+      <w:pPr>
+        <w:rPr>
+          <w:lang w:val="de-CH"/>
+        </w:rPr>
+      </w:pPr>
+    </w:p>
+    <w:p>
+      <w:pPr>
+        <w:rPr>
+          <w:lang w:val="de-CH"/>
+        </w:rPr>
+      </w:pPr>
+    </w:p>
+    <w:p>
+      <w:pPr>
+        <w:rPr>
+          <w:lang w:val="de-CH"/>
+        </w:rPr>
+      </w:pPr>
+    </w:p>
+    <w:p>
+      <w:pPr>
+        <w:rPr>
+          <w:lang w:val="de-CH"/>
+        </w:rPr>
+      </w:pPr>
+    </w:p>
+    <w:tbl>
+      <w:tblPr>
+        <w:tblStyle w:val="TableGrid"/>
+        <w:tblW w:w="0" w:type="auto"/>
+        <w:tblLook w:val="04A0" w:firstRow="1" w:lastRow="0" w:firstColumn="1" w:lastColumn="0" w:noHBand="0" w:noVBand="1"/>
+      </w:tblPr>
+      <w:tblGrid>
+        <w:gridCol w:w="4674"/>
+        <w:gridCol w:w="4676"/>
       </w:tblGrid>
       <w:tr>
         <w:tc>
@@ -58,6 +1874,7 @@
                 <w:szCs w:val="22"/>
                 <w:lang w:val="de-CH"/>
               </w:rPr>
+              <w:lastRenderedPageBreak/>
               <w:t xml:space="preserve">Allgemeine Angaben </w:t>
             </w:r>
           </w:p>
@@ -66,49 +1883,178 @@
       <w:tr>
         <w:tc>
           <w:tcPr>
-            <w:tcW w:w="4673" w:type="dxa"/>
-          </w:tcPr>
-          <w:p>
-            <w:pPr>
-              <w:rPr>
-                <w:rFonts w:cs="Times New Roman"/>
-                <w:sz w:val="22"/>
-                <w:szCs w:val="22"/>
-                <w:lang w:val="de-CH"/>
-              </w:rPr>
-            </w:pPr>
-            <w:r>
-              <w:rPr>
-                <w:rFonts w:cs="Times New Roman"/>
-                <w:sz w:val="22"/>
-                <w:szCs w:val="22"/>
-                <w:lang w:val="de-CH"/>
-              </w:rPr>
-              <w:t xml:space="preserve">Bitte geben Sie ihr Alter an. </w:t>
-            </w:r>
-          </w:p>
-        </w:tc>
-        <w:tc>
-          <w:tcPr>
-            <w:tcW w:w="4677" w:type="dxa"/>
-          </w:tcPr>
-          <w:p>
-            <w:pPr>
-              <w:rPr>
-                <w:rFonts w:cs="Times New Roman"/>
-                <w:sz w:val="22"/>
-                <w:szCs w:val="22"/>
-                <w:lang w:val="de-CH"/>
-              </w:rPr>
-            </w:pPr>
-            <w:r>
-              <w:rPr>
-                <w:rFonts w:cs="Times New Roman"/>
-                <w:sz w:val="22"/>
-                <w:szCs w:val="22"/>
-                <w:lang w:val="de-CH"/>
-              </w:rPr>
-              <w:t xml:space="preserve">Freitext </w:t>
+            <w:tcW w:w="4674" w:type="dxa"/>
+          </w:tcPr>
+          <w:p>
+            <w:pPr>
+              <w:rPr>
+                <w:rFonts w:cs="Times New Roman"/>
+                <w:sz w:val="22"/>
+                <w:szCs w:val="22"/>
+                <w:lang w:val="de-CH"/>
+              </w:rPr>
+            </w:pPr>
+            <w:r>
+              <w:rPr>
+                <w:rFonts w:cs="Times New Roman"/>
+                <w:sz w:val="22"/>
+                <w:szCs w:val="22"/>
+                <w:lang w:val="de-CH"/>
+              </w:rPr>
+              <w:t>Wie viel Erfahrung haben Sie mit Virtual-Reality-(VR)-Brillen?</w:t>
+            </w:r>
+          </w:p>
+        </w:tc>
+        <w:tc>
+          <w:tcPr>
+            <w:tcW w:w="4676" w:type="dxa"/>
+          </w:tcPr>
+          <w:p>
+            <w:pPr>
+              <w:rPr>
+                <w:rFonts w:cs="Times New Roman"/>
+                <w:sz w:val="22"/>
+                <w:szCs w:val="22"/>
+                <w:lang w:val="de-CH"/>
+              </w:rPr>
+            </w:pPr>
+            <w:r>
+              <w:rPr>
+                <w:rFonts w:cs="Times New Roman"/>
+                <w:sz w:val="22"/>
+                <w:szCs w:val="22"/>
+                <w:lang w:val="de-CH"/>
+              </w:rPr>
+              <w:t xml:space="preserve">Keine Erfahrung </w:t>
+            </w:r>
+          </w:p>
+          <w:p>
+            <w:pPr>
+              <w:rPr>
+                <w:rFonts w:cs="Times New Roman"/>
+                <w:sz w:val="22"/>
+                <w:szCs w:val="22"/>
+                <w:lang w:val="de-CH"/>
+              </w:rPr>
+            </w:pPr>
+            <w:r>
+              <w:rPr>
+                <w:rFonts w:cs="Times New Roman"/>
+                <w:sz w:val="22"/>
+                <w:szCs w:val="22"/>
+                <w:lang w:val="de-CH"/>
+              </w:rPr>
+              <w:t>Wenig Erfahrung (1-</w:t>
+            </w:r>
+            <w:r>
+              <w:rPr>
+                <w:rFonts w:cs="Times New Roman"/>
+                <w:sz w:val="22"/>
+                <w:szCs w:val="22"/>
+                <w:lang w:val="de-CH"/>
+              </w:rPr>
+              <w:t>2</w:t>
+            </w:r>
+            <w:r>
+              <w:rPr>
+                <w:rFonts w:cs="Times New Roman"/>
+                <w:sz w:val="22"/>
+                <w:szCs w:val="22"/>
+                <w:lang w:val="de-CH"/>
+              </w:rPr>
+              <w:t xml:space="preserve"> Anwendungen)</w:t>
+            </w:r>
+          </w:p>
+          <w:p>
+            <w:pPr>
+              <w:rPr>
+                <w:rFonts w:cs="Times New Roman"/>
+                <w:sz w:val="22"/>
+                <w:szCs w:val="22"/>
+                <w:lang w:val="de-CH"/>
+              </w:rPr>
+            </w:pPr>
+            <w:r>
+              <w:rPr>
+                <w:rFonts w:cs="Times New Roman"/>
+                <w:sz w:val="22"/>
+                <w:szCs w:val="22"/>
+                <w:lang w:val="de-CH"/>
+              </w:rPr>
+              <w:t>Etwas Erfahrung (</w:t>
+            </w:r>
+            <w:r>
+              <w:rPr>
+                <w:rFonts w:cs="Times New Roman"/>
+                <w:sz w:val="22"/>
+                <w:szCs w:val="22"/>
+                <w:lang w:val="de-CH"/>
+              </w:rPr>
+              <w:t>2</w:t>
+            </w:r>
+            <w:r>
+              <w:rPr>
+                <w:rFonts w:cs="Times New Roman"/>
+                <w:sz w:val="22"/>
+                <w:szCs w:val="22"/>
+                <w:lang w:val="de-CH"/>
+              </w:rPr>
+              <w:t>-</w:t>
+            </w:r>
+            <w:r>
+              <w:rPr>
+                <w:rFonts w:cs="Times New Roman"/>
+                <w:sz w:val="22"/>
+                <w:szCs w:val="22"/>
+                <w:lang w:val="de-CH"/>
+              </w:rPr>
+              <w:t>5</w:t>
+            </w:r>
+            <w:r>
+              <w:rPr>
+                <w:rFonts w:cs="Times New Roman"/>
+                <w:sz w:val="22"/>
+                <w:szCs w:val="22"/>
+                <w:lang w:val="de-CH"/>
+              </w:rPr>
+              <w:t xml:space="preserve"> Anwendungen)</w:t>
+            </w:r>
+          </w:p>
+          <w:p>
+            <w:pPr>
+              <w:rPr>
+                <w:rFonts w:cs="Times New Roman"/>
+                <w:sz w:val="22"/>
+                <w:szCs w:val="22"/>
+                <w:lang w:val="de-CH"/>
+              </w:rPr>
+            </w:pPr>
+            <w:r>
+              <w:rPr>
+                <w:rFonts w:cs="Times New Roman"/>
+                <w:sz w:val="22"/>
+                <w:szCs w:val="22"/>
+                <w:lang w:val="de-CH"/>
+              </w:rPr>
+              <w:t xml:space="preserve">Viel Erfahrung (mehr als </w:t>
+            </w:r>
+            <w:r>
+              <w:rPr>
+                <w:rFonts w:cs="Times New Roman"/>
+                <w:sz w:val="22"/>
+                <w:szCs w:val="22"/>
+                <w:lang w:val="de-CH"/>
+              </w:rPr>
+              <w:t>5</w:t>
+            </w:r>
+            <w:r>
+              <w:rPr>
+                <w:rFonts w:cs="Times New Roman"/>
+                <w:sz w:val="22"/>
+                <w:szCs w:val="22"/>
+                <w:lang w:val="de-CH"/>
+              </w:rPr>
+              <w:t xml:space="preserve"> Anwendungen) </w:t>
             </w:r>
           </w:p>
         </w:tc>
@@ -116,178 +2062,120 @@
       <w:tr>
         <w:tc>
           <w:tcPr>
-            <w:tcW w:w="4673" w:type="dxa"/>
-          </w:tcPr>
-          <w:p>
-            <w:pPr>
-              <w:rPr>
-                <w:rFonts w:cs="Times New Roman"/>
-                <w:sz w:val="22"/>
-                <w:szCs w:val="22"/>
-                <w:lang w:val="de-CH"/>
-              </w:rPr>
-            </w:pPr>
-            <w:r>
-              <w:rPr>
-                <w:rFonts w:cs="Times New Roman"/>
-                <w:sz w:val="22"/>
-                <w:szCs w:val="22"/>
-                <w:lang w:val="de-CH"/>
-              </w:rPr>
-              <w:t>Wie viel Erfahrung haben Sie mit Virtual-Reality-(VR)-Brillen?</w:t>
-            </w:r>
-          </w:p>
-        </w:tc>
-        <w:tc>
-          <w:tcPr>
-            <w:tcW w:w="4677" w:type="dxa"/>
-          </w:tcPr>
-          <w:p>
-            <w:pPr>
-              <w:rPr>
-                <w:rFonts w:cs="Times New Roman"/>
-                <w:sz w:val="22"/>
-                <w:szCs w:val="22"/>
-                <w:lang w:val="de-CH"/>
-              </w:rPr>
-            </w:pPr>
-            <w:r>
-              <w:rPr>
-                <w:rFonts w:cs="Times New Roman"/>
-                <w:sz w:val="22"/>
-                <w:szCs w:val="22"/>
-                <w:lang w:val="de-CH"/>
-              </w:rPr>
-              <w:t xml:space="preserve">Keine Erfahrung </w:t>
-            </w:r>
-          </w:p>
-          <w:p>
-            <w:pPr>
-              <w:rPr>
-                <w:rFonts w:cs="Times New Roman"/>
-                <w:sz w:val="22"/>
-                <w:szCs w:val="22"/>
-                <w:lang w:val="de-CH"/>
-              </w:rPr>
-            </w:pPr>
-            <w:r>
-              <w:rPr>
-                <w:rFonts w:cs="Times New Roman"/>
-                <w:sz w:val="22"/>
-                <w:szCs w:val="22"/>
-                <w:lang w:val="de-CH"/>
-              </w:rPr>
-              <w:t>Wenig Erfahrung (1-</w:t>
-            </w:r>
-            <w:r>
-              <w:rPr>
-                <w:rFonts w:cs="Times New Roman"/>
-                <w:sz w:val="22"/>
-                <w:szCs w:val="22"/>
-                <w:lang w:val="de-CH"/>
-              </w:rPr>
-              <w:t>2</w:t>
-            </w:r>
-            <w:r>
-              <w:rPr>
-                <w:rFonts w:cs="Times New Roman"/>
-                <w:sz w:val="22"/>
-                <w:szCs w:val="22"/>
-                <w:lang w:val="de-CH"/>
-              </w:rPr>
-              <w:t xml:space="preserve"> Anwendungen)</w:t>
-            </w:r>
-          </w:p>
-          <w:p>
-            <w:pPr>
-              <w:rPr>
-                <w:rFonts w:cs="Times New Roman"/>
-                <w:sz w:val="22"/>
-                <w:szCs w:val="22"/>
-                <w:lang w:val="de-CH"/>
-              </w:rPr>
-            </w:pPr>
-            <w:r>
-              <w:rPr>
-                <w:rFonts w:cs="Times New Roman"/>
-                <w:sz w:val="22"/>
-                <w:szCs w:val="22"/>
-                <w:lang w:val="de-CH"/>
-              </w:rPr>
-              <w:t>Etwas Erfahrung (</w:t>
-            </w:r>
-            <w:r>
-              <w:rPr>
-                <w:rFonts w:cs="Times New Roman"/>
-                <w:sz w:val="22"/>
-                <w:szCs w:val="22"/>
-                <w:lang w:val="de-CH"/>
-              </w:rPr>
-              <w:t>2</w:t>
-            </w:r>
-            <w:r>
-              <w:rPr>
-                <w:rFonts w:cs="Times New Roman"/>
-                <w:sz w:val="22"/>
-                <w:szCs w:val="22"/>
-                <w:lang w:val="de-CH"/>
-              </w:rPr>
-              <w:t>-</w:t>
-            </w:r>
-            <w:r>
-              <w:rPr>
-                <w:rFonts w:cs="Times New Roman"/>
-                <w:sz w:val="22"/>
-                <w:szCs w:val="22"/>
-                <w:lang w:val="de-CH"/>
-              </w:rPr>
-              <w:t>5</w:t>
-            </w:r>
-            <w:r>
-              <w:rPr>
-                <w:rFonts w:cs="Times New Roman"/>
-                <w:sz w:val="22"/>
-                <w:szCs w:val="22"/>
-                <w:lang w:val="de-CH"/>
-              </w:rPr>
-              <w:t xml:space="preserve"> Anwendungen)</w:t>
-            </w:r>
-          </w:p>
-          <w:p>
-            <w:pPr>
-              <w:rPr>
-                <w:rFonts w:cs="Times New Roman"/>
-                <w:sz w:val="22"/>
-                <w:szCs w:val="22"/>
-                <w:lang w:val="de-CH"/>
-              </w:rPr>
-            </w:pPr>
-            <w:r>
-              <w:rPr>
-                <w:rFonts w:cs="Times New Roman"/>
-                <w:sz w:val="22"/>
-                <w:szCs w:val="22"/>
-                <w:lang w:val="de-CH"/>
-              </w:rPr>
-              <w:t xml:space="preserve">Viel Erfahrung (mehr als </w:t>
-            </w:r>
-            <w:r>
-              <w:rPr>
-                <w:rFonts w:cs="Times New Roman"/>
-                <w:sz w:val="22"/>
-                <w:szCs w:val="22"/>
-                <w:lang w:val="de-CH"/>
-              </w:rPr>
-              <w:t>5</w:t>
-            </w:r>
-            <w:r>
-              <w:rPr>
-                <w:rFonts w:cs="Times New Roman"/>
-                <w:sz w:val="22"/>
-                <w:szCs w:val="22"/>
-                <w:lang w:val="de-CH"/>
-              </w:rPr>
-              <w:t xml:space="preserve"> Anwendungen) </w:t>
+            <w:tcW w:w="4674" w:type="dxa"/>
+          </w:tcPr>
+          <w:p>
+            <w:pPr>
+              <w:pStyle w:val="p1"/>
+              <w:rPr>
+                <w:rFonts w:asciiTheme="minorHAnsi" w:hAnsiTheme="minorHAnsi"/>
+                <w:sz w:val="22"/>
+                <w:szCs w:val="22"/>
+                <w:lang w:val="de-CH"/>
+              </w:rPr>
+            </w:pPr>
+            <w:r>
+              <w:rPr>
+                <w:rFonts w:asciiTheme="minorHAnsi" w:hAnsiTheme="minorHAnsi"/>
+                <w:sz w:val="22"/>
+                <w:szCs w:val="22"/>
+                <w:lang w:val="de-CH"/>
+              </w:rPr>
+              <w:t>Wie haben Sie die Anwendung verwendet?</w:t>
+            </w:r>
+          </w:p>
+          <w:p>
+            <w:pPr>
+              <w:spacing w:before="100" w:beforeAutospacing="1" w:after="100" w:afterAutospacing="1"/>
+              <w:rPr>
+                <w:rStyle w:val="s1"/>
+                <w:rFonts w:cs="Times New Roman"/>
+                <w:sz w:val="22"/>
+                <w:szCs w:val="22"/>
+                <w:lang w:val="de-CH"/>
+              </w:rPr>
+            </w:pPr>
+          </w:p>
+        </w:tc>
+        <w:tc>
+          <w:tcPr>
+            <w:tcW w:w="4676" w:type="dxa"/>
+          </w:tcPr>
+          <w:p>
+            <w:pPr>
+              <w:rPr>
+                <w:rFonts w:cs="Times New Roman"/>
+                <w:sz w:val="22"/>
+                <w:szCs w:val="22"/>
+                <w:lang w:val="de-CH"/>
+              </w:rPr>
+            </w:pPr>
+            <w:r>
+              <w:rPr>
+                <w:rFonts w:cs="Times New Roman"/>
+                <w:sz w:val="22"/>
+                <w:szCs w:val="22"/>
+                <w:lang w:val="de-CH"/>
+              </w:rPr>
+              <w:t>Direkt auf der VR-Brille (</w:t>
+            </w:r>
+            <w:proofErr w:type="spellStart"/>
+            <w:r>
+              <w:rPr>
+                <w:rFonts w:cs="Times New Roman"/>
+                <w:sz w:val="22"/>
+                <w:szCs w:val="22"/>
+                <w:lang w:val="de-CH"/>
+              </w:rPr>
+              <w:t>Standalone</w:t>
+            </w:r>
+            <w:proofErr w:type="spellEnd"/>
+            <w:r>
+              <w:rPr>
+                <w:rFonts w:cs="Times New Roman"/>
+                <w:sz w:val="22"/>
+                <w:szCs w:val="22"/>
+                <w:lang w:val="de-CH"/>
+              </w:rPr>
+              <w:t xml:space="preserve">/Deploy) </w:t>
+            </w:r>
+          </w:p>
+          <w:p>
+            <w:pPr>
+              <w:rPr>
+                <w:rFonts w:cs="Times New Roman"/>
+                <w:sz w:val="22"/>
+                <w:szCs w:val="22"/>
+                <w:lang w:val="de-CH"/>
+              </w:rPr>
+            </w:pPr>
+            <w:r>
+              <w:rPr>
+                <w:rFonts w:cs="Times New Roman"/>
+                <w:sz w:val="22"/>
+                <w:szCs w:val="22"/>
+                <w:lang w:val="de-CH"/>
+              </w:rPr>
+              <w:t xml:space="preserve">Per Streaming vom Computer auf die VR-Brille </w:t>
+            </w:r>
+          </w:p>
+          <w:p>
+            <w:pPr>
+              <w:rPr>
+                <w:rFonts w:cs="Times New Roman"/>
+                <w:sz w:val="22"/>
+                <w:szCs w:val="22"/>
+                <w:lang w:val="de-CH"/>
+              </w:rPr>
+            </w:pPr>
+            <w:r>
+              <w:rPr>
+                <w:rFonts w:cs="Times New Roman"/>
+                <w:sz w:val="22"/>
+                <w:szCs w:val="22"/>
+                <w:lang w:val="de-CH"/>
+              </w:rPr>
+              <w:t xml:space="preserve">Weiss ich nicht </w:t>
             </w:r>
           </w:p>
         </w:tc>
@@ -295,102 +2183,150 @@
       <w:tr>
         <w:tc>
           <w:tcPr>
-            <w:tcW w:w="4673" w:type="dxa"/>
-          </w:tcPr>
-          <w:p>
-            <w:pPr>
-              <w:pStyle w:val="p1"/>
-              <w:rPr>
-                <w:rFonts w:asciiTheme="minorHAnsi" w:hAnsiTheme="minorHAnsi"/>
-                <w:sz w:val="22"/>
-                <w:szCs w:val="22"/>
-                <w:lang w:val="de-CH"/>
-              </w:rPr>
-            </w:pPr>
-            <w:r>
-              <w:rPr>
-                <w:rFonts w:asciiTheme="minorHAnsi" w:hAnsiTheme="minorHAnsi"/>
-                <w:sz w:val="22"/>
-                <w:szCs w:val="22"/>
-                <w:lang w:val="de-CH"/>
-              </w:rPr>
-              <w:t>Wie haben Sie die Anwendung verwendet?</w:t>
-            </w:r>
-          </w:p>
+            <w:tcW w:w="4674" w:type="dxa"/>
+          </w:tcPr>
           <w:p>
             <w:pPr>
               <w:spacing w:before="100" w:beforeAutospacing="1" w:after="100" w:afterAutospacing="1"/>
               <w:rPr>
+                <w:rFonts w:cs="Times New Roman"/>
+                <w:sz w:val="22"/>
+                <w:szCs w:val="22"/>
+                <w:lang w:val="de-CH"/>
+              </w:rPr>
+            </w:pPr>
+            <w:r>
+              <w:rPr>
                 <w:rStyle w:val="s1"/>
                 <w:rFonts w:cs="Times New Roman"/>
                 <w:sz w:val="22"/>
                 <w:szCs w:val="22"/>
                 <w:lang w:val="de-CH"/>
               </w:rPr>
-            </w:pPr>
-          </w:p>
-        </w:tc>
-        <w:tc>
-          <w:tcPr>
-            <w:tcW w:w="4677" w:type="dxa"/>
-          </w:tcPr>
-          <w:p>
-            <w:pPr>
-              <w:rPr>
-                <w:rFonts w:cs="Times New Roman"/>
-                <w:sz w:val="22"/>
-                <w:szCs w:val="22"/>
-                <w:lang w:val="de-CH"/>
-              </w:rPr>
-            </w:pPr>
-            <w:r>
-              <w:rPr>
-                <w:rFonts w:cs="Times New Roman"/>
-                <w:sz w:val="22"/>
-                <w:szCs w:val="22"/>
-                <w:lang w:val="de-CH"/>
-              </w:rPr>
-              <w:t>Direkt auf der VR-Brille (</w:t>
-            </w:r>
-            <w:proofErr w:type="spellStart"/>
-            <w:r>
-              <w:rPr>
-                <w:rFonts w:cs="Times New Roman"/>
-                <w:sz w:val="22"/>
-                <w:szCs w:val="22"/>
-                <w:lang w:val="de-CH"/>
-              </w:rPr>
-              <w:t>Standalone</w:t>
-            </w:r>
-            <w:proofErr w:type="spellEnd"/>
-            <w:r>
-              <w:rPr>
-                <w:rFonts w:cs="Times New Roman"/>
-                <w:sz w:val="22"/>
-                <w:szCs w:val="22"/>
-                <w:lang w:val="de-CH"/>
-              </w:rPr>
-              <w:t xml:space="preserve">/Deploy) </w:t>
-            </w:r>
-          </w:p>
-          <w:p>
-            <w:pPr>
-              <w:rPr>
-                <w:rFonts w:cs="Times New Roman"/>
-                <w:sz w:val="22"/>
-                <w:szCs w:val="22"/>
-                <w:lang w:val="de-CH"/>
-              </w:rPr>
-            </w:pPr>
-            <w:r>
-              <w:rPr>
-                <w:rFonts w:cs="Times New Roman"/>
-                <w:sz w:val="22"/>
-                <w:szCs w:val="22"/>
-                <w:lang w:val="de-CH"/>
-              </w:rPr>
-              <w:t xml:space="preserve">Per Streaming vom Computer auf die VR-Brille </w:t>
-            </w:r>
+              <w:t>Welche VR-Brillen haben Sie bereits verwendet?</w:t>
+            </w:r>
+            <w:r>
+              <w:rPr>
+                <w:rStyle w:val="s2"/>
+                <w:rFonts w:cs="Times New Roman"/>
+                <w:sz w:val="22"/>
+                <w:szCs w:val="22"/>
+                <w:lang w:val="de-CH"/>
+              </w:rPr>
+              <w:t xml:space="preserve"> </w:t>
+            </w:r>
+            <w:r>
+              <w:rPr>
+                <w:rStyle w:val="s1"/>
+                <w:rFonts w:cs="Times New Roman"/>
+                <w:sz w:val="22"/>
+                <w:szCs w:val="22"/>
+                <w:lang w:val="de-CH"/>
+              </w:rPr>
+              <w:t>(Mehrfachauswahl möglich)</w:t>
+            </w:r>
+          </w:p>
+          <w:p>
+            <w:pPr>
+              <w:rPr>
+                <w:rFonts w:cs="Times New Roman"/>
+                <w:sz w:val="22"/>
+                <w:szCs w:val="22"/>
+                <w:lang w:val="de-CH"/>
+              </w:rPr>
+            </w:pPr>
+          </w:p>
+        </w:tc>
+        <w:tc>
+          <w:tcPr>
+            <w:tcW w:w="4676" w:type="dxa"/>
+          </w:tcPr>
+          <w:p>
+            <w:pPr>
+              <w:rPr>
+                <w:rFonts w:cs="Times New Roman"/>
+                <w:sz w:val="22"/>
+                <w:szCs w:val="22"/>
+                <w:lang w:val="it-CH"/>
+              </w:rPr>
+            </w:pPr>
+            <w:r>
+              <w:rPr>
+                <w:rFonts w:cs="Times New Roman"/>
+                <w:sz w:val="22"/>
+                <w:szCs w:val="22"/>
+                <w:lang w:val="it-CH"/>
+              </w:rPr>
+              <w:t xml:space="preserve">Meta Quest </w:t>
+            </w:r>
+          </w:p>
+          <w:p>
+            <w:pPr>
+              <w:rPr>
+                <w:rFonts w:cs="Times New Roman"/>
+                <w:sz w:val="22"/>
+                <w:szCs w:val="22"/>
+                <w:lang w:val="it-CH"/>
+              </w:rPr>
+            </w:pPr>
+            <w:r>
+              <w:rPr>
+                <w:rFonts w:cs="Times New Roman"/>
+                <w:sz w:val="22"/>
+                <w:szCs w:val="22"/>
+                <w:lang w:val="it-CH"/>
+              </w:rPr>
+              <w:t>Apple Vision Pro</w:t>
+            </w:r>
+          </w:p>
+          <w:p>
+            <w:pPr>
+              <w:rPr>
+                <w:rFonts w:cs="Times New Roman"/>
+                <w:sz w:val="22"/>
+                <w:szCs w:val="22"/>
+                <w:lang w:val="it-CH"/>
+              </w:rPr>
+            </w:pPr>
+            <w:r>
+              <w:rPr>
+                <w:rFonts w:cs="Times New Roman"/>
+                <w:sz w:val="22"/>
+                <w:szCs w:val="22"/>
+                <w:lang w:val="it-CH"/>
+              </w:rPr>
+              <w:t>Vive Focus 3</w:t>
+            </w:r>
+          </w:p>
+          <w:p>
+            <w:pPr>
+              <w:rPr>
+                <w:rFonts w:cs="Times New Roman"/>
+                <w:sz w:val="22"/>
+                <w:szCs w:val="22"/>
+                <w:lang w:val="de-CH"/>
+              </w:rPr>
+            </w:pPr>
+            <w:r>
+              <w:rPr>
+                <w:rFonts w:cs="Times New Roman"/>
+                <w:sz w:val="22"/>
+                <w:szCs w:val="22"/>
+                <w:lang w:val="de-CH"/>
+              </w:rPr>
+              <w:t xml:space="preserve">Vive </w:t>
+            </w:r>
+            <w:proofErr w:type="gramStart"/>
+            <w:r>
+              <w:rPr>
+                <w:rFonts w:cs="Times New Roman"/>
+                <w:sz w:val="22"/>
+                <w:szCs w:val="22"/>
+                <w:lang w:val="de-CH"/>
+              </w:rPr>
+              <w:t>XR Elite</w:t>
+            </w:r>
+            <w:proofErr w:type="gramEnd"/>
           </w:p>
           <w:p>
             <w:pPr>
@@ -416,7 +2352,7 @@
       <w:tr>
         <w:tc>
           <w:tcPr>
-            <w:tcW w:w="4673" w:type="dxa"/>
+            <w:tcW w:w="4674" w:type="dxa"/>
           </w:tcPr>
           <w:p>
             <w:pPr>
@@ -436,279 +2372,133 @@
                 <w:szCs w:val="22"/>
                 <w:lang w:val="de-CH"/>
               </w:rPr>
-              <w:t>Welche VR-Brillen haben Sie bereits verwendet?</w:t>
-            </w:r>
-            <w:r>
-              <w:rPr>
-                <w:rStyle w:val="s2"/>
-                <w:rFonts w:cs="Times New Roman"/>
-                <w:sz w:val="22"/>
-                <w:szCs w:val="22"/>
-                <w:lang w:val="de-CH"/>
-              </w:rPr>
-              <w:t xml:space="preserve"> </w:t>
-            </w:r>
-            <w:r>
-              <w:rPr>
-                <w:rStyle w:val="s1"/>
-                <w:rFonts w:cs="Times New Roman"/>
-                <w:sz w:val="22"/>
-                <w:szCs w:val="22"/>
-                <w:lang w:val="de-CH"/>
-              </w:rPr>
-              <w:t>(Mehrfachauswahl möglich)</w:t>
-            </w:r>
-          </w:p>
-          <w:p>
-            <w:pPr>
-              <w:rPr>
-                <w:rFonts w:cs="Times New Roman"/>
-                <w:sz w:val="22"/>
-                <w:szCs w:val="22"/>
-                <w:lang w:val="de-CH"/>
-              </w:rPr>
-            </w:pPr>
-          </w:p>
-        </w:tc>
-        <w:tc>
-          <w:tcPr>
-            <w:tcW w:w="4677" w:type="dxa"/>
-          </w:tcPr>
-          <w:p>
-            <w:pPr>
-              <w:rPr>
-                <w:rFonts w:cs="Times New Roman"/>
-                <w:sz w:val="22"/>
-                <w:szCs w:val="22"/>
-                <w:lang w:val="it-CH"/>
-              </w:rPr>
-            </w:pPr>
-            <w:r>
-              <w:rPr>
-                <w:rFonts w:cs="Times New Roman"/>
-                <w:sz w:val="22"/>
-                <w:szCs w:val="22"/>
-                <w:lang w:val="it-CH"/>
-              </w:rPr>
-              <w:t xml:space="preserve">Meta Quest </w:t>
-            </w:r>
-          </w:p>
-          <w:p>
-            <w:pPr>
-              <w:rPr>
-                <w:rFonts w:cs="Times New Roman"/>
-                <w:sz w:val="22"/>
-                <w:szCs w:val="22"/>
-                <w:lang w:val="it-CH"/>
-              </w:rPr>
-            </w:pPr>
-            <w:r>
-              <w:rPr>
-                <w:rFonts w:cs="Times New Roman"/>
-                <w:sz w:val="22"/>
-                <w:szCs w:val="22"/>
-                <w:lang w:val="it-CH"/>
-              </w:rPr>
-              <w:t>Apple Vision Pro</w:t>
-            </w:r>
-          </w:p>
-          <w:p>
-            <w:pPr>
-              <w:rPr>
-                <w:rFonts w:cs="Times New Roman"/>
-                <w:sz w:val="22"/>
-                <w:szCs w:val="22"/>
-                <w:lang w:val="it-CH"/>
-              </w:rPr>
-            </w:pPr>
-            <w:r>
-              <w:rPr>
-                <w:rFonts w:cs="Times New Roman"/>
-                <w:sz w:val="22"/>
-                <w:szCs w:val="22"/>
-                <w:lang w:val="it-CH"/>
-              </w:rPr>
-              <w:t>Vive Focus 3</w:t>
-            </w:r>
-          </w:p>
-          <w:p>
-            <w:pPr>
-              <w:rPr>
-                <w:rFonts w:cs="Times New Roman"/>
-                <w:sz w:val="22"/>
-                <w:szCs w:val="22"/>
-                <w:lang w:val="it-CH"/>
-              </w:rPr>
-            </w:pPr>
-            <w:r>
-              <w:rPr>
-                <w:rFonts w:cs="Times New Roman"/>
-                <w:sz w:val="22"/>
-                <w:szCs w:val="22"/>
-                <w:lang w:val="it-CH"/>
-              </w:rPr>
-              <w:t>Vive XR Elite</w:t>
-            </w:r>
-          </w:p>
-          <w:p>
-            <w:pPr>
-              <w:rPr>
-                <w:rFonts w:cs="Times New Roman"/>
-                <w:sz w:val="22"/>
-                <w:szCs w:val="22"/>
-                <w:lang w:val="de-CH"/>
-              </w:rPr>
-            </w:pPr>
-            <w:r>
-              <w:rPr>
-                <w:rFonts w:cs="Times New Roman"/>
-                <w:sz w:val="22"/>
-                <w:szCs w:val="22"/>
-                <w:lang w:val="de-CH"/>
-              </w:rPr>
-              <w:t xml:space="preserve">Weiss ich nicht </w:t>
+              <w:t>Wie schätzen Sie Ihre allgemeine technische Affinität ein?</w:t>
+            </w:r>
+          </w:p>
+          <w:p>
+            <w:pPr>
+              <w:rPr>
+                <w:rFonts w:cs="Times New Roman"/>
+                <w:sz w:val="22"/>
+                <w:szCs w:val="22"/>
+                <w:lang w:val="de-CH"/>
+              </w:rPr>
+            </w:pPr>
+          </w:p>
+        </w:tc>
+        <w:tc>
+          <w:tcPr>
+            <w:tcW w:w="4676" w:type="dxa"/>
+          </w:tcPr>
+          <w:p>
+            <w:pPr>
+              <w:rPr>
+                <w:rFonts w:cs="Times New Roman"/>
+                <w:sz w:val="22"/>
+                <w:szCs w:val="22"/>
+                <w:lang w:val="de-CH"/>
+              </w:rPr>
+            </w:pPr>
+            <w:r>
+              <w:rPr>
+                <w:rFonts w:cs="Times New Roman"/>
+                <w:sz w:val="22"/>
+                <w:szCs w:val="22"/>
+                <w:lang w:val="de-CH"/>
+              </w:rPr>
+              <w:t>Sehr gering</w:t>
+            </w:r>
+          </w:p>
+          <w:p>
+            <w:pPr>
+              <w:rPr>
+                <w:rFonts w:cs="Times New Roman"/>
+                <w:sz w:val="22"/>
+                <w:szCs w:val="22"/>
+                <w:lang w:val="de-CH"/>
+              </w:rPr>
+            </w:pPr>
+            <w:r>
+              <w:rPr>
+                <w:rFonts w:cs="Times New Roman"/>
+                <w:sz w:val="22"/>
+                <w:szCs w:val="22"/>
+                <w:lang w:val="de-CH"/>
+              </w:rPr>
+              <w:t>Gering</w:t>
+            </w:r>
+          </w:p>
+          <w:p>
+            <w:pPr>
+              <w:rPr>
+                <w:rFonts w:cs="Times New Roman"/>
+                <w:sz w:val="22"/>
+                <w:szCs w:val="22"/>
+                <w:lang w:val="de-CH"/>
+              </w:rPr>
+            </w:pPr>
+            <w:r>
+              <w:rPr>
+                <w:rFonts w:cs="Times New Roman"/>
+                <w:sz w:val="22"/>
+                <w:szCs w:val="22"/>
+                <w:lang w:val="de-CH"/>
+              </w:rPr>
+              <w:t xml:space="preserve">Mittel </w:t>
+            </w:r>
+          </w:p>
+          <w:p>
+            <w:pPr>
+              <w:rPr>
+                <w:rFonts w:cs="Times New Roman"/>
+                <w:sz w:val="22"/>
+                <w:szCs w:val="22"/>
+                <w:lang w:val="de-CH"/>
+              </w:rPr>
+            </w:pPr>
+            <w:r>
+              <w:rPr>
+                <w:rFonts w:cs="Times New Roman"/>
+                <w:sz w:val="22"/>
+                <w:szCs w:val="22"/>
+                <w:lang w:val="de-CH"/>
+              </w:rPr>
+              <w:t>Hoch</w:t>
+            </w:r>
+          </w:p>
+          <w:p>
+            <w:pPr>
+              <w:rPr>
+                <w:rFonts w:cs="Times New Roman"/>
+                <w:sz w:val="22"/>
+                <w:szCs w:val="22"/>
+                <w:lang w:val="de-CH"/>
+              </w:rPr>
+            </w:pPr>
+            <w:r>
+              <w:rPr>
+                <w:rFonts w:cs="Times New Roman"/>
+                <w:sz w:val="22"/>
+                <w:szCs w:val="22"/>
+                <w:lang w:val="de-CH"/>
+              </w:rPr>
+              <w:t>Sehr hoch</w:t>
             </w:r>
           </w:p>
         </w:tc>
       </w:tr>
-      <w:tr>
-        <w:tc>
-          <w:tcPr>
-            <w:tcW w:w="4673" w:type="dxa"/>
-          </w:tcPr>
-          <w:p>
-            <w:pPr>
-              <w:spacing w:before="100" w:beforeAutospacing="1" w:after="100" w:afterAutospacing="1"/>
-              <w:rPr>
-                <w:rFonts w:cs="Times New Roman"/>
-                <w:sz w:val="22"/>
-                <w:szCs w:val="22"/>
-                <w:lang w:val="de-CH"/>
-              </w:rPr>
-            </w:pPr>
-            <w:r>
-              <w:rPr>
-                <w:rStyle w:val="s1"/>
-                <w:rFonts w:cs="Times New Roman"/>
-                <w:sz w:val="22"/>
-                <w:szCs w:val="22"/>
-                <w:lang w:val="de-CH"/>
-              </w:rPr>
-              <w:t>Wie schätzen Sie Ihre allgemeine technische Affinität ein?</w:t>
-            </w:r>
-          </w:p>
-          <w:p>
-            <w:pPr>
-              <w:rPr>
-                <w:rFonts w:cs="Times New Roman"/>
-                <w:sz w:val="22"/>
-                <w:szCs w:val="22"/>
-                <w:lang w:val="de-CH"/>
-              </w:rPr>
-            </w:pPr>
-          </w:p>
-        </w:tc>
-        <w:tc>
-          <w:tcPr>
-            <w:tcW w:w="4677" w:type="dxa"/>
-          </w:tcPr>
-          <w:p>
-            <w:pPr>
-              <w:rPr>
-                <w:rFonts w:cs="Times New Roman"/>
-                <w:sz w:val="22"/>
-                <w:szCs w:val="22"/>
-                <w:lang w:val="de-CH"/>
-              </w:rPr>
-            </w:pPr>
-            <w:r>
-              <w:rPr>
-                <w:rFonts w:cs="Times New Roman"/>
-                <w:sz w:val="22"/>
-                <w:szCs w:val="22"/>
-                <w:lang w:val="de-CH"/>
-              </w:rPr>
-              <w:t>Sehr gering</w:t>
-            </w:r>
-          </w:p>
-          <w:p>
-            <w:pPr>
-              <w:rPr>
-                <w:rFonts w:cs="Times New Roman"/>
-                <w:sz w:val="22"/>
-                <w:szCs w:val="22"/>
-                <w:lang w:val="de-CH"/>
-              </w:rPr>
-            </w:pPr>
-            <w:r>
-              <w:rPr>
-                <w:rFonts w:cs="Times New Roman"/>
-                <w:sz w:val="22"/>
-                <w:szCs w:val="22"/>
-                <w:lang w:val="de-CH"/>
-              </w:rPr>
-              <w:t>Gering</w:t>
-            </w:r>
-          </w:p>
-          <w:p>
-            <w:pPr>
-              <w:rPr>
-                <w:rFonts w:cs="Times New Roman"/>
-                <w:sz w:val="22"/>
-                <w:szCs w:val="22"/>
-                <w:lang w:val="de-CH"/>
-              </w:rPr>
-            </w:pPr>
-            <w:r>
-              <w:rPr>
-                <w:rFonts w:cs="Times New Roman"/>
-                <w:sz w:val="22"/>
-                <w:szCs w:val="22"/>
-                <w:lang w:val="de-CH"/>
-              </w:rPr>
-              <w:t xml:space="preserve">Mittel </w:t>
-            </w:r>
-          </w:p>
-          <w:p>
-            <w:pPr>
-              <w:rPr>
-                <w:rFonts w:cs="Times New Roman"/>
-                <w:sz w:val="22"/>
-                <w:szCs w:val="22"/>
-                <w:lang w:val="de-CH"/>
-              </w:rPr>
-            </w:pPr>
-            <w:r>
-              <w:rPr>
-                <w:rFonts w:cs="Times New Roman"/>
-                <w:sz w:val="22"/>
-                <w:szCs w:val="22"/>
-                <w:lang w:val="de-CH"/>
-              </w:rPr>
-              <w:t>Hoch</w:t>
-            </w:r>
-          </w:p>
-          <w:p>
-            <w:pPr>
-              <w:rPr>
-                <w:rFonts w:cs="Times New Roman"/>
-                <w:sz w:val="22"/>
-                <w:szCs w:val="22"/>
-                <w:lang w:val="de-CH"/>
-              </w:rPr>
-            </w:pPr>
-            <w:r>
-              <w:rPr>
-                <w:rFonts w:cs="Times New Roman"/>
-                <w:sz w:val="22"/>
-                <w:szCs w:val="22"/>
-                <w:lang w:val="de-CH"/>
-              </w:rPr>
-              <w:t>Sehr hoch</w:t>
-            </w:r>
-          </w:p>
-        </w:tc>
-      </w:tr>
+    </w:tbl>
+    <w:p/>
+    <w:tbl>
+      <w:tblPr>
+        <w:tblStyle w:val="TableGrid"/>
+        <w:tblW w:w="0" w:type="auto"/>
+        <w:tblLook w:val="04A0" w:firstRow="1" w:lastRow="0" w:firstColumn="1" w:lastColumn="0" w:noHBand="0" w:noVBand="1"/>
+      </w:tblPr>
+      <w:tblGrid>
+        <w:gridCol w:w="4674"/>
+        <w:gridCol w:w="4676"/>
+      </w:tblGrid>
       <w:tr>
         <w:tc>
           <w:tcPr>
@@ -760,7 +2550,7 @@
       <w:tr>
         <w:tc>
           <w:tcPr>
-            <w:tcW w:w="4673" w:type="dxa"/>
+            <w:tcW w:w="4674" w:type="dxa"/>
           </w:tcPr>
           <w:p>
             <w:pPr>
@@ -784,7 +2574,7 @@
         </w:tc>
         <w:tc>
           <w:tcPr>
-            <w:tcW w:w="4677" w:type="dxa"/>
+            <w:tcW w:w="4676" w:type="dxa"/>
           </w:tcPr>
           <w:p>
             <w:pPr>
@@ -878,7 +2668,27 @@
                 <w:szCs w:val="22"/>
                 <w:lang w:val="de-CH"/>
               </w:rPr>
-              <w:t xml:space="preserve">5)Stimme voll und ganz zu </w:t>
+              <w:t xml:space="preserve">5)Stimme </w:t>
+            </w:r>
+            <w:proofErr w:type="gramStart"/>
+            <w:r>
+              <w:rPr>
+                <w:rFonts w:cs="Times New Roman"/>
+                <w:sz w:val="22"/>
+                <w:szCs w:val="22"/>
+                <w:lang w:val="de-CH"/>
+              </w:rPr>
+              <w:t xml:space="preserve">voll und ganz </w:t>
+            </w:r>
+            <w:proofErr w:type="gramEnd"/>
+            <w:r>
+              <w:rPr>
+                <w:rFonts w:cs="Times New Roman"/>
+                <w:sz w:val="22"/>
+                <w:szCs w:val="22"/>
+                <w:lang w:val="de-CH"/>
+              </w:rPr>
+              <w:t xml:space="preserve">zu </w:t>
             </w:r>
           </w:p>
         </w:tc>
@@ -886,7 +2696,7 @@
       <w:tr>
         <w:tc>
           <w:tcPr>
-            <w:tcW w:w="4673" w:type="dxa"/>
+            <w:tcW w:w="4674" w:type="dxa"/>
           </w:tcPr>
           <w:p>
             <w:pPr>
@@ -911,7 +2721,7 @@
         </w:tc>
         <w:tc>
           <w:tcPr>
-            <w:tcW w:w="4677" w:type="dxa"/>
+            <w:tcW w:w="4676" w:type="dxa"/>
           </w:tcPr>
           <w:p>
             <w:pPr>
@@ -1005,7 +2815,27 @@
                 <w:szCs w:val="22"/>
                 <w:lang w:val="de-CH"/>
               </w:rPr>
-              <w:t>5)Stimme voll und ganz zu</w:t>
+              <w:t xml:space="preserve">5)Stimme </w:t>
+            </w:r>
+            <w:proofErr w:type="gramStart"/>
+            <w:r>
+              <w:rPr>
+                <w:rFonts w:cs="Times New Roman"/>
+                <w:sz w:val="22"/>
+                <w:szCs w:val="22"/>
+                <w:lang w:val="de-CH"/>
+              </w:rPr>
+              <w:t xml:space="preserve">voll und ganz </w:t>
+            </w:r>
+            <w:proofErr w:type="gramEnd"/>
+            <w:r>
+              <w:rPr>
+                <w:rFonts w:cs="Times New Roman"/>
+                <w:sz w:val="22"/>
+                <w:szCs w:val="22"/>
+                <w:lang w:val="de-CH"/>
+              </w:rPr>
+              <w:t>zu</w:t>
             </w:r>
           </w:p>
         </w:tc>
@@ -1013,7 +2843,7 @@
       <w:tr>
         <w:tc>
           <w:tcPr>
-            <w:tcW w:w="4673" w:type="dxa"/>
+            <w:tcW w:w="4674" w:type="dxa"/>
           </w:tcPr>
           <w:p>
             <w:pPr>
@@ -1038,7 +2868,7 @@
         </w:tc>
         <w:tc>
           <w:tcPr>
-            <w:tcW w:w="4677" w:type="dxa"/>
+            <w:tcW w:w="4676" w:type="dxa"/>
           </w:tcPr>
           <w:p>
             <w:pPr>
@@ -1132,7 +2962,27 @@
                 <w:szCs w:val="22"/>
                 <w:lang w:val="de-CH"/>
               </w:rPr>
-              <w:t>5)Stimme voll und ganz zu</w:t>
+              <w:t xml:space="preserve">5)Stimme </w:t>
+            </w:r>
+            <w:proofErr w:type="gramStart"/>
+            <w:r>
+              <w:rPr>
+                <w:rFonts w:cs="Times New Roman"/>
+                <w:sz w:val="22"/>
+                <w:szCs w:val="22"/>
+                <w:lang w:val="de-CH"/>
+              </w:rPr>
+              <w:t xml:space="preserve">voll und ganz </w:t>
+            </w:r>
+            <w:proofErr w:type="gramEnd"/>
+            <w:r>
+              <w:rPr>
+                <w:rFonts w:cs="Times New Roman"/>
+                <w:sz w:val="22"/>
+                <w:szCs w:val="22"/>
+                <w:lang w:val="de-CH"/>
+              </w:rPr>
+              <w:t>zu</w:t>
             </w:r>
           </w:p>
         </w:tc>
@@ -1140,7 +2990,7 @@
       <w:tr>
         <w:tc>
           <w:tcPr>
-            <w:tcW w:w="4673" w:type="dxa"/>
+            <w:tcW w:w="4674" w:type="dxa"/>
           </w:tcPr>
           <w:p>
             <w:pPr>
@@ -1165,7 +3015,7 @@
         </w:tc>
         <w:tc>
           <w:tcPr>
-            <w:tcW w:w="4677" w:type="dxa"/>
+            <w:tcW w:w="4676" w:type="dxa"/>
           </w:tcPr>
           <w:p>
             <w:pPr>
@@ -1259,7 +3109,27 @@
                 <w:szCs w:val="22"/>
                 <w:lang w:val="de-CH"/>
               </w:rPr>
-              <w:t>5)Stimme voll und ganz zu</w:t>
+              <w:t xml:space="preserve">5)Stimme </w:t>
+            </w:r>
+            <w:proofErr w:type="gramStart"/>
+            <w:r>
+              <w:rPr>
+                <w:rFonts w:cs="Times New Roman"/>
+                <w:sz w:val="22"/>
+                <w:szCs w:val="22"/>
+                <w:lang w:val="de-CH"/>
+              </w:rPr>
+              <w:t xml:space="preserve">voll und ganz </w:t>
+            </w:r>
+            <w:proofErr w:type="gramEnd"/>
+            <w:r>
+              <w:rPr>
+                <w:rFonts w:cs="Times New Roman"/>
+                <w:sz w:val="22"/>
+                <w:szCs w:val="22"/>
+                <w:lang w:val="de-CH"/>
+              </w:rPr>
+              <w:t>zu</w:t>
             </w:r>
           </w:p>
         </w:tc>
@@ -1267,7 +3137,7 @@
       <w:tr>
         <w:tc>
           <w:tcPr>
-            <w:tcW w:w="4673" w:type="dxa"/>
+            <w:tcW w:w="4674" w:type="dxa"/>
           </w:tcPr>
           <w:p>
             <w:pPr>
@@ -1293,7 +3163,7 @@
         </w:tc>
         <w:tc>
           <w:tcPr>
-            <w:tcW w:w="4677" w:type="dxa"/>
+            <w:tcW w:w="4676" w:type="dxa"/>
           </w:tcPr>
           <w:p>
             <w:pPr>
@@ -1387,11 +3257,44 @@
                 <w:szCs w:val="22"/>
                 <w:lang w:val="de-CH"/>
               </w:rPr>
-              <w:t>5)Stimme voll und ganz zu</w:t>
+              <w:t xml:space="preserve">5)Stimme </w:t>
+            </w:r>
+            <w:proofErr w:type="gramStart"/>
+            <w:r>
+              <w:rPr>
+                <w:rFonts w:cs="Times New Roman"/>
+                <w:sz w:val="22"/>
+                <w:szCs w:val="22"/>
+                <w:lang w:val="de-CH"/>
+              </w:rPr>
+              <w:t xml:space="preserve">voll und ganz </w:t>
+            </w:r>
+            <w:proofErr w:type="gramEnd"/>
+            <w:r>
+              <w:rPr>
+                <w:rFonts w:cs="Times New Roman"/>
+                <w:sz w:val="22"/>
+                <w:szCs w:val="22"/>
+                <w:lang w:val="de-CH"/>
+              </w:rPr>
+              <w:t>zu</w:t>
             </w:r>
           </w:p>
         </w:tc>
       </w:tr>
+    </w:tbl>
+    <w:p/>
+    <w:p/>
+    <w:tbl>
+      <w:tblPr>
+        <w:tblStyle w:val="TableGrid"/>
+        <w:tblW w:w="0" w:type="auto"/>
+        <w:tblLook w:val="04A0" w:firstRow="1" w:lastRow="0" w:firstColumn="1" w:lastColumn="0" w:noHBand="0" w:noVBand="1"/>
+      </w:tblPr>
+      <w:tblGrid>
+        <w:gridCol w:w="4674"/>
+        <w:gridCol w:w="4676"/>
+      </w:tblGrid>
       <w:tr>
         <w:tc>
           <w:tcPr>
@@ -1421,7 +3324,6 @@
                 <w:szCs w:val="22"/>
                 <w:lang w:val="de-CH"/>
               </w:rPr>
-              <w:lastRenderedPageBreak/>
               <w:t xml:space="preserve">Falls Sie eine </w:t>
             </w:r>
             <w:proofErr w:type="spellStart"/>
@@ -1456,7 +3358,7 @@
       <w:tr>
         <w:tc>
           <w:tcPr>
-            <w:tcW w:w="4673" w:type="dxa"/>
+            <w:tcW w:w="4674" w:type="dxa"/>
           </w:tcPr>
           <w:p>
             <w:pPr>
@@ -1483,7 +3385,7 @@
         </w:tc>
         <w:tc>
           <w:tcPr>
-            <w:tcW w:w="4677" w:type="dxa"/>
+            <w:tcW w:w="4676" w:type="dxa"/>
           </w:tcPr>
           <w:p>
             <w:pPr>
@@ -1577,7 +3479,27 @@
                 <w:szCs w:val="22"/>
                 <w:lang w:val="de-CH"/>
               </w:rPr>
-              <w:t>5)Stimme voll und ganz zu</w:t>
+              <w:t xml:space="preserve">5)Stimme </w:t>
+            </w:r>
+            <w:proofErr w:type="gramStart"/>
+            <w:r>
+              <w:rPr>
+                <w:rFonts w:cs="Times New Roman"/>
+                <w:sz w:val="22"/>
+                <w:szCs w:val="22"/>
+                <w:lang w:val="de-CH"/>
+              </w:rPr>
+              <w:t xml:space="preserve">voll und ganz </w:t>
+            </w:r>
+            <w:proofErr w:type="gramEnd"/>
+            <w:r>
+              <w:rPr>
+                <w:rFonts w:cs="Times New Roman"/>
+                <w:sz w:val="22"/>
+                <w:szCs w:val="22"/>
+                <w:lang w:val="de-CH"/>
+              </w:rPr>
+              <w:t>zu</w:t>
             </w:r>
           </w:p>
         </w:tc>
@@ -1585,7 +3507,7 @@
       <w:tr>
         <w:tc>
           <w:tcPr>
-            <w:tcW w:w="4673" w:type="dxa"/>
+            <w:tcW w:w="4674" w:type="dxa"/>
           </w:tcPr>
           <w:p>
             <w:pPr>
@@ -1612,7 +3534,7 @@
         </w:tc>
         <w:tc>
           <w:tcPr>
-            <w:tcW w:w="4677" w:type="dxa"/>
+            <w:tcW w:w="4676" w:type="dxa"/>
           </w:tcPr>
           <w:p>
             <w:pPr>
@@ -1706,7 +3628,27 @@
                 <w:szCs w:val="22"/>
                 <w:lang w:val="de-CH"/>
               </w:rPr>
-              <w:t>5)Stimme voll und ganz zu</w:t>
+              <w:t xml:space="preserve">5)Stimme </w:t>
+            </w:r>
+            <w:proofErr w:type="gramStart"/>
+            <w:r>
+              <w:rPr>
+                <w:rFonts w:cs="Times New Roman"/>
+                <w:sz w:val="22"/>
+                <w:szCs w:val="22"/>
+                <w:lang w:val="de-CH"/>
+              </w:rPr>
+              <w:t xml:space="preserve">voll und ganz </w:t>
+            </w:r>
+            <w:proofErr w:type="gramEnd"/>
+            <w:r>
+              <w:rPr>
+                <w:rFonts w:cs="Times New Roman"/>
+                <w:sz w:val="22"/>
+                <w:szCs w:val="22"/>
+                <w:lang w:val="de-CH"/>
+              </w:rPr>
+              <w:t>zu</w:t>
             </w:r>
           </w:p>
         </w:tc>
@@ -1714,7 +3656,7 @@
       <w:tr>
         <w:tc>
           <w:tcPr>
-            <w:tcW w:w="4673" w:type="dxa"/>
+            <w:tcW w:w="4674" w:type="dxa"/>
           </w:tcPr>
           <w:p>
             <w:pPr>
@@ -1741,7 +3683,7 @@
         </w:tc>
         <w:tc>
           <w:tcPr>
-            <w:tcW w:w="4677" w:type="dxa"/>
+            <w:tcW w:w="4676" w:type="dxa"/>
           </w:tcPr>
           <w:p>
             <w:pPr>
@@ -1835,11 +3777,43 @@
                 <w:szCs w:val="22"/>
                 <w:lang w:val="de-CH"/>
               </w:rPr>
-              <w:t>5)Stimme voll und ganz zu</w:t>
+              <w:t xml:space="preserve">5)Stimme </w:t>
+            </w:r>
+            <w:proofErr w:type="gramStart"/>
+            <w:r>
+              <w:rPr>
+                <w:rFonts w:cs="Times New Roman"/>
+                <w:sz w:val="22"/>
+                <w:szCs w:val="22"/>
+                <w:lang w:val="de-CH"/>
+              </w:rPr>
+              <w:t xml:space="preserve">voll und ganz </w:t>
+            </w:r>
+            <w:proofErr w:type="gramEnd"/>
+            <w:r>
+              <w:rPr>
+                <w:rFonts w:cs="Times New Roman"/>
+                <w:sz w:val="22"/>
+                <w:szCs w:val="22"/>
+                <w:lang w:val="de-CH"/>
+              </w:rPr>
+              <w:t>zu</w:t>
             </w:r>
           </w:p>
         </w:tc>
       </w:tr>
+    </w:tbl>
+    <w:p/>
+    <w:tbl>
+      <w:tblPr>
+        <w:tblStyle w:val="TableGrid"/>
+        <w:tblW w:w="0" w:type="auto"/>
+        <w:tblLook w:val="04A0" w:firstRow="1" w:lastRow="0" w:firstColumn="1" w:lastColumn="0" w:noHBand="0" w:noVBand="1"/>
+      </w:tblPr>
+      <w:tblGrid>
+        <w:gridCol w:w="4674"/>
+        <w:gridCol w:w="4676"/>
+      </w:tblGrid>
       <w:tr>
         <w:tc>
           <w:tcPr>
@@ -1877,7 +3851,7 @@
       <w:tr>
         <w:tc>
           <w:tcPr>
-            <w:tcW w:w="4673" w:type="dxa"/>
+            <w:tcW w:w="4674" w:type="dxa"/>
           </w:tcPr>
           <w:p>
             <w:pPr>
@@ -1902,7 +3876,7 @@
         </w:tc>
         <w:tc>
           <w:tcPr>
-            <w:tcW w:w="4677" w:type="dxa"/>
+            <w:tcW w:w="4676" w:type="dxa"/>
           </w:tcPr>
           <w:p>
             <w:pPr>
@@ -1996,7 +3970,27 @@
                 <w:szCs w:val="22"/>
                 <w:lang w:val="de-CH"/>
               </w:rPr>
-              <w:t>5)Stimme voll und ganz zu</w:t>
+              <w:t xml:space="preserve">5)Stimme </w:t>
+            </w:r>
+            <w:proofErr w:type="gramStart"/>
+            <w:r>
+              <w:rPr>
+                <w:rFonts w:cs="Times New Roman"/>
+                <w:sz w:val="22"/>
+                <w:szCs w:val="22"/>
+                <w:lang w:val="de-CH"/>
+              </w:rPr>
+              <w:t xml:space="preserve">voll und ganz </w:t>
+            </w:r>
+            <w:proofErr w:type="gramEnd"/>
+            <w:r>
+              <w:rPr>
+                <w:rFonts w:cs="Times New Roman"/>
+                <w:sz w:val="22"/>
+                <w:szCs w:val="22"/>
+                <w:lang w:val="de-CH"/>
+              </w:rPr>
+              <w:t>zu</w:t>
             </w:r>
           </w:p>
         </w:tc>
@@ -2004,7 +3998,7 @@
       <w:tr>
         <w:tc>
           <w:tcPr>
-            <w:tcW w:w="4673" w:type="dxa"/>
+            <w:tcW w:w="4674" w:type="dxa"/>
           </w:tcPr>
           <w:p>
             <w:pPr>
@@ -2029,7 +4023,7 @@
         </w:tc>
         <w:tc>
           <w:tcPr>
-            <w:tcW w:w="4677" w:type="dxa"/>
+            <w:tcW w:w="4676" w:type="dxa"/>
           </w:tcPr>
           <w:p>
             <w:pPr>
@@ -2123,11 +4117,43 @@
                 <w:szCs w:val="22"/>
                 <w:lang w:val="de-CH"/>
               </w:rPr>
-              <w:t>5)Stimme voll und ganz zu</w:t>
+              <w:t xml:space="preserve">5)Stimme </w:t>
+            </w:r>
+            <w:proofErr w:type="gramStart"/>
+            <w:r>
+              <w:rPr>
+                <w:rFonts w:cs="Times New Roman"/>
+                <w:sz w:val="22"/>
+                <w:szCs w:val="22"/>
+                <w:lang w:val="de-CH"/>
+              </w:rPr>
+              <w:t xml:space="preserve">voll und ganz </w:t>
+            </w:r>
+            <w:proofErr w:type="gramEnd"/>
+            <w:r>
+              <w:rPr>
+                <w:rFonts w:cs="Times New Roman"/>
+                <w:sz w:val="22"/>
+                <w:szCs w:val="22"/>
+                <w:lang w:val="de-CH"/>
+              </w:rPr>
+              <w:t>zu</w:t>
             </w:r>
           </w:p>
         </w:tc>
       </w:tr>
+    </w:tbl>
+    <w:p/>
+    <w:tbl>
+      <w:tblPr>
+        <w:tblStyle w:val="TableGrid"/>
+        <w:tblW w:w="0" w:type="auto"/>
+        <w:tblLook w:val="04A0" w:firstRow="1" w:lastRow="0" w:firstColumn="1" w:lastColumn="0" w:noHBand="0" w:noVBand="1"/>
+      </w:tblPr>
+      <w:tblGrid>
+        <w:gridCol w:w="4674"/>
+        <w:gridCol w:w="4676"/>
+      </w:tblGrid>
       <w:tr>
         <w:tc>
           <w:tcPr>
@@ -2138,499 +4164,60 @@
           <w:p>
             <w:pPr>
               <w:rPr>
-                <w:rFonts w:cs="Times New Roman"/>
-                <w:b/>
-                <w:bCs/>
-                <w:color w:val="FFFFFF" w:themeColor="background1"/>
-                <w:sz w:val="22"/>
-                <w:szCs w:val="22"/>
-                <w:lang w:val="de-CH"/>
-              </w:rPr>
-            </w:pPr>
-            <w:r>
-              <w:rPr>
-                <w:b/>
-                <w:bCs/>
-                <w:color w:val="FFFFFF" w:themeColor="background1"/>
-                <w:sz w:val="22"/>
-                <w:szCs w:val="22"/>
-                <w:lang w:val="de-CH"/>
-              </w:rPr>
-              <w:t xml:space="preserve">Gesamteindruck </w:t>
+                <w:b/>
+                <w:bCs/>
+                <w:color w:val="FFFFFF" w:themeColor="background1"/>
+                <w:sz w:val="22"/>
+                <w:szCs w:val="22"/>
+                <w:lang w:val="de-CH"/>
+              </w:rPr>
+            </w:pPr>
+            <w:r>
+              <w:rPr>
+                <w:b/>
+                <w:bCs/>
+                <w:color w:val="FFFFFF" w:themeColor="background1"/>
+                <w:sz w:val="22"/>
+                <w:szCs w:val="22"/>
+                <w:lang w:val="de-CH"/>
+              </w:rPr>
+              <w:t xml:space="preserve">Offene Fragen </w:t>
             </w:r>
           </w:p>
         </w:tc>
       </w:tr>
       <w:tr>
-        <w:tc>
-          <w:tcPr>
-            <w:tcW w:w="4673" w:type="dxa"/>
+        <w:trPr>
+          <w:trHeight w:val="1920"/>
+        </w:trPr>
+        <w:tc>
+          <w:tcPr>
+            <w:tcW w:w="4674" w:type="dxa"/>
           </w:tcPr>
           <w:p>
             <w:pPr>
               <w:spacing w:before="100" w:beforeAutospacing="1" w:after="100" w:afterAutospacing="1"/>
               <w:rPr>
-                <w:rStyle w:val="s1"/>
-                <w:rFonts w:cs="Times New Roman"/>
-                <w:sz w:val="22"/>
-                <w:szCs w:val="22"/>
-                <w:lang w:val="de-CH"/>
-              </w:rPr>
-            </w:pPr>
-            <w:r>
-              <w:rPr>
-                <w:rFonts w:cs="Times New Roman"/>
-                <w:sz w:val="22"/>
-                <w:szCs w:val="22"/>
-                <w:lang w:val="de-CH"/>
-              </w:rPr>
-              <w:t>Insgesamt bin ich mit der Anwendung zufrieden.</w:t>
-            </w:r>
-          </w:p>
-        </w:tc>
-        <w:tc>
-          <w:tcPr>
-            <w:tcW w:w="4677" w:type="dxa"/>
-          </w:tcPr>
-          <w:p>
-            <w:pPr>
-              <w:rPr>
-                <w:rFonts w:cs="Times New Roman"/>
-                <w:sz w:val="22"/>
-                <w:szCs w:val="22"/>
-                <w:lang w:val="de-CH"/>
-              </w:rPr>
-            </w:pPr>
-            <w:r>
-              <w:rPr>
-                <w:rFonts w:cs="Times New Roman"/>
-                <w:sz w:val="22"/>
-                <w:szCs w:val="22"/>
-                <w:lang w:val="de-CH"/>
-              </w:rPr>
-              <w:t xml:space="preserve">1)Stimme überhaupt nicht zu </w:t>
-            </w:r>
-          </w:p>
-          <w:p>
-            <w:pPr>
-              <w:rPr>
-                <w:rFonts w:cs="Times New Roman"/>
-                <w:sz w:val="22"/>
-                <w:szCs w:val="22"/>
-                <w:lang w:val="de-CH"/>
-              </w:rPr>
-            </w:pPr>
-            <w:r>
-              <w:rPr>
-                <w:rFonts w:cs="Times New Roman"/>
-                <w:sz w:val="22"/>
-                <w:szCs w:val="22"/>
-                <w:lang w:val="de-CH"/>
-              </w:rPr>
-              <w:t xml:space="preserve">2)Stimme eher nicht zu </w:t>
-            </w:r>
-          </w:p>
-          <w:p>
-            <w:pPr>
-              <w:rPr>
-                <w:rFonts w:cs="Times New Roman"/>
-                <w:sz w:val="22"/>
-                <w:szCs w:val="22"/>
-                <w:lang w:val="de-CH"/>
-              </w:rPr>
-            </w:pPr>
-            <w:r>
-              <w:rPr>
-                <w:rFonts w:cs="Times New Roman"/>
-                <w:sz w:val="22"/>
-                <w:szCs w:val="22"/>
-                <w:lang w:val="de-CH"/>
-              </w:rPr>
-              <w:t>3)Weder noch</w:t>
-            </w:r>
-          </w:p>
-          <w:p>
-            <w:pPr>
-              <w:rPr>
-                <w:rFonts w:cs="Times New Roman"/>
-                <w:sz w:val="22"/>
-                <w:szCs w:val="22"/>
-                <w:lang w:val="de-CH"/>
-              </w:rPr>
-            </w:pPr>
-            <w:r>
-              <w:rPr>
-                <w:rFonts w:cs="Times New Roman"/>
-                <w:sz w:val="22"/>
-                <w:szCs w:val="22"/>
-                <w:lang w:val="de-CH"/>
-              </w:rPr>
-              <w:t xml:space="preserve">4)Stimme eher zu </w:t>
-            </w:r>
-          </w:p>
-          <w:p>
-            <w:pPr>
-              <w:rPr>
-                <w:rFonts w:cs="Times New Roman"/>
-                <w:sz w:val="22"/>
-                <w:szCs w:val="22"/>
-                <w:lang w:val="de-CH"/>
-              </w:rPr>
-            </w:pPr>
-            <w:r>
-              <w:rPr>
-                <w:rFonts w:cs="Times New Roman"/>
-                <w:sz w:val="22"/>
-                <w:szCs w:val="22"/>
-                <w:lang w:val="de-CH"/>
-              </w:rPr>
-              <w:t>5)Stimme voll und ganz zu</w:t>
-            </w:r>
-          </w:p>
-        </w:tc>
-      </w:tr>
-      <w:tr>
-        <w:tc>
-          <w:tcPr>
-            <w:tcW w:w="4673" w:type="dxa"/>
-          </w:tcPr>
-          <w:p>
-            <w:pPr>
-              <w:spacing w:before="100" w:beforeAutospacing="1" w:after="100" w:afterAutospacing="1"/>
-              <w:rPr>
-                <w:rFonts w:cs="Times New Roman"/>
-                <w:sz w:val="22"/>
-                <w:szCs w:val="22"/>
-                <w:lang w:val="de-CH"/>
-              </w:rPr>
-            </w:pPr>
-            <w:r>
-              <w:rPr>
-                <w:rFonts w:cs="Times New Roman"/>
-                <w:sz w:val="22"/>
-                <w:szCs w:val="22"/>
-                <w:lang w:val="de-CH"/>
-              </w:rPr>
-              <w:t>Ich würde die Anwendung erneut verwenden.</w:t>
-            </w:r>
-          </w:p>
-        </w:tc>
-        <w:tc>
-          <w:tcPr>
-            <w:tcW w:w="4677" w:type="dxa"/>
-          </w:tcPr>
-          <w:p>
-            <w:pPr>
-              <w:rPr>
-                <w:rFonts w:cs="Times New Roman"/>
-                <w:sz w:val="22"/>
-                <w:szCs w:val="22"/>
-                <w:lang w:val="de-CH"/>
-              </w:rPr>
-            </w:pPr>
-            <w:r>
-              <w:rPr>
-                <w:rFonts w:cs="Times New Roman"/>
-                <w:sz w:val="22"/>
-                <w:szCs w:val="22"/>
-                <w:lang w:val="de-CH"/>
-              </w:rPr>
-              <w:t xml:space="preserve">1)Stimme überhaupt nicht zu </w:t>
-            </w:r>
-          </w:p>
-          <w:p>
-            <w:pPr>
-              <w:rPr>
-                <w:rFonts w:cs="Times New Roman"/>
-                <w:sz w:val="22"/>
-                <w:szCs w:val="22"/>
-                <w:lang w:val="de-CH"/>
-              </w:rPr>
-            </w:pPr>
-            <w:r>
-              <w:rPr>
-                <w:rFonts w:cs="Times New Roman"/>
-                <w:sz w:val="22"/>
-                <w:szCs w:val="22"/>
-                <w:lang w:val="de-CH"/>
-              </w:rPr>
-              <w:t xml:space="preserve">2)Stimme eher nicht zu </w:t>
-            </w:r>
-          </w:p>
-          <w:p>
-            <w:pPr>
-              <w:rPr>
-                <w:rFonts w:cs="Times New Roman"/>
-                <w:sz w:val="22"/>
-                <w:szCs w:val="22"/>
-                <w:lang w:val="de-CH"/>
-              </w:rPr>
-            </w:pPr>
-            <w:r>
-              <w:rPr>
-                <w:rFonts w:cs="Times New Roman"/>
-                <w:sz w:val="22"/>
-                <w:szCs w:val="22"/>
-                <w:lang w:val="de-CH"/>
-              </w:rPr>
-              <w:t>3)Weder noch</w:t>
-            </w:r>
-          </w:p>
-          <w:p>
-            <w:pPr>
-              <w:rPr>
-                <w:rFonts w:cs="Times New Roman"/>
-                <w:sz w:val="22"/>
-                <w:szCs w:val="22"/>
-                <w:lang w:val="de-CH"/>
-              </w:rPr>
-            </w:pPr>
-            <w:r>
-              <w:rPr>
-                <w:rFonts w:cs="Times New Roman"/>
-                <w:sz w:val="22"/>
-                <w:szCs w:val="22"/>
-                <w:lang w:val="de-CH"/>
-              </w:rPr>
-              <w:t xml:space="preserve">4)Stimme eher zu </w:t>
-            </w:r>
-          </w:p>
-          <w:p>
-            <w:pPr>
-              <w:rPr>
-                <w:rFonts w:cs="Times New Roman"/>
-                <w:sz w:val="22"/>
-                <w:szCs w:val="22"/>
-                <w:lang w:val="de-CH"/>
-              </w:rPr>
-            </w:pPr>
-            <w:r>
-              <w:rPr>
-                <w:rFonts w:cs="Times New Roman"/>
-                <w:sz w:val="22"/>
-                <w:szCs w:val="22"/>
-                <w:lang w:val="de-CH"/>
-              </w:rPr>
-              <w:t>5)Stimme voll und ganz zu</w:t>
-            </w:r>
-          </w:p>
-        </w:tc>
-      </w:tr>
-      <w:tr>
-        <w:tc>
-          <w:tcPr>
-            <w:tcW w:w="4673" w:type="dxa"/>
-          </w:tcPr>
-          <w:p>
-            <w:pPr>
-              <w:spacing w:before="100" w:beforeAutospacing="1" w:after="100" w:afterAutospacing="1"/>
-              <w:rPr>
-                <w:rFonts w:cs="Times New Roman"/>
-                <w:sz w:val="22"/>
-                <w:szCs w:val="22"/>
-                <w:lang w:val="de-CH"/>
-              </w:rPr>
-            </w:pPr>
-            <w:r>
-              <w:rPr>
-                <w:rFonts w:cs="Times New Roman"/>
-                <w:sz w:val="22"/>
-                <w:szCs w:val="22"/>
-                <w:lang w:val="de-CH"/>
-              </w:rPr>
-              <w:t xml:space="preserve">Die Anwendung eignet sich für die Betrachtung von Bildern </w:t>
-            </w:r>
-            <w:r>
-              <w:rPr>
-                <w:rFonts w:cs="Times New Roman"/>
-                <w:sz w:val="22"/>
-                <w:szCs w:val="22"/>
-                <w:lang w:val="de-CH"/>
-              </w:rPr>
-              <w:t xml:space="preserve">und 3D-Objekten </w:t>
-            </w:r>
-            <w:r>
-              <w:rPr>
-                <w:rFonts w:cs="Times New Roman"/>
-                <w:sz w:val="22"/>
-                <w:szCs w:val="22"/>
-                <w:lang w:val="de-CH"/>
-              </w:rPr>
-              <w:t>in einem virtuellen Museum.</w:t>
-            </w:r>
-          </w:p>
-        </w:tc>
-        <w:tc>
-          <w:tcPr>
-            <w:tcW w:w="4677" w:type="dxa"/>
-          </w:tcPr>
-          <w:p>
-            <w:pPr>
-              <w:rPr>
-                <w:rFonts w:cs="Times New Roman"/>
-                <w:sz w:val="22"/>
-                <w:szCs w:val="22"/>
-                <w:lang w:val="de-CH"/>
-              </w:rPr>
-            </w:pPr>
-            <w:r>
-              <w:rPr>
-                <w:rFonts w:cs="Times New Roman"/>
-                <w:sz w:val="22"/>
-                <w:szCs w:val="22"/>
-                <w:lang w:val="de-CH"/>
-              </w:rPr>
-              <w:t xml:space="preserve">1)Stimme überhaupt nicht zu </w:t>
-            </w:r>
-          </w:p>
-          <w:p>
-            <w:pPr>
-              <w:rPr>
-                <w:rFonts w:cs="Times New Roman"/>
-                <w:sz w:val="22"/>
-                <w:szCs w:val="22"/>
-                <w:lang w:val="de-CH"/>
-              </w:rPr>
-            </w:pPr>
-            <w:r>
-              <w:rPr>
-                <w:rFonts w:cs="Times New Roman"/>
-                <w:sz w:val="22"/>
-                <w:szCs w:val="22"/>
-                <w:lang w:val="de-CH"/>
-              </w:rPr>
-              <w:t xml:space="preserve">2)Stimme eher nicht zu </w:t>
-            </w:r>
-          </w:p>
-          <w:p>
-            <w:pPr>
-              <w:rPr>
-                <w:rFonts w:cs="Times New Roman"/>
-                <w:sz w:val="22"/>
-                <w:szCs w:val="22"/>
-                <w:lang w:val="de-CH"/>
-              </w:rPr>
-            </w:pPr>
-            <w:r>
-              <w:rPr>
-                <w:rFonts w:cs="Times New Roman"/>
-                <w:sz w:val="22"/>
-                <w:szCs w:val="22"/>
-                <w:lang w:val="de-CH"/>
-              </w:rPr>
-              <w:t>3)Weder noch</w:t>
-            </w:r>
-          </w:p>
-          <w:p>
-            <w:pPr>
-              <w:rPr>
-                <w:rFonts w:cs="Times New Roman"/>
-                <w:sz w:val="22"/>
-                <w:szCs w:val="22"/>
-                <w:lang w:val="de-CH"/>
-              </w:rPr>
-            </w:pPr>
-            <w:r>
-              <w:rPr>
-                <w:rFonts w:cs="Times New Roman"/>
-                <w:sz w:val="22"/>
-                <w:szCs w:val="22"/>
-                <w:lang w:val="de-CH"/>
-              </w:rPr>
-              <w:t xml:space="preserve">4)Stimme eher zu </w:t>
-            </w:r>
-          </w:p>
-          <w:p>
-            <w:pPr>
-              <w:rPr>
-                <w:rFonts w:cs="Times New Roman"/>
-                <w:sz w:val="22"/>
-                <w:szCs w:val="22"/>
-                <w:lang w:val="de-CH"/>
-              </w:rPr>
-            </w:pPr>
-            <w:r>
-              <w:rPr>
-                <w:rFonts w:cs="Times New Roman"/>
-                <w:sz w:val="22"/>
-                <w:szCs w:val="22"/>
-                <w:lang w:val="de-CH"/>
-              </w:rPr>
-              <w:t>5)Stimme voll und ganz zu</w:t>
-            </w:r>
-          </w:p>
-        </w:tc>
-      </w:tr>
-      <w:tr>
-        <w:tc>
-          <w:tcPr>
-            <w:tcW w:w="9350" w:type="dxa"/>
-            <w:gridSpan w:val="2"/>
-            <w:shd w:val="clear" w:color="auto" w:fill="156082" w:themeFill="accent1"/>
-          </w:tcPr>
-          <w:p>
-            <w:pPr>
-              <w:rPr>
-                <w:b/>
-                <w:bCs/>
-                <w:color w:val="FFFFFF" w:themeColor="background1"/>
-                <w:sz w:val="22"/>
-                <w:szCs w:val="22"/>
-                <w:lang w:val="de-CH"/>
-              </w:rPr>
-            </w:pPr>
-            <w:r>
-              <w:rPr>
-                <w:b/>
-                <w:bCs/>
-                <w:color w:val="FFFFFF" w:themeColor="background1"/>
-                <w:sz w:val="22"/>
-                <w:szCs w:val="22"/>
-                <w:lang w:val="de-CH"/>
-              </w:rPr>
-              <w:t xml:space="preserve">Offene Fragen </w:t>
-            </w:r>
-          </w:p>
-        </w:tc>
-      </w:tr>
-      <w:tr>
-        <w:tc>
-          <w:tcPr>
-            <w:tcW w:w="4673" w:type="dxa"/>
-          </w:tcPr>
-          <w:p>
-            <w:pPr>
-              <w:spacing w:before="100" w:beforeAutospacing="1" w:after="100" w:afterAutospacing="1"/>
-              <w:rPr>
-                <w:rFonts w:cs="Times New Roman"/>
-                <w:sz w:val="22"/>
-                <w:szCs w:val="22"/>
-                <w:lang w:val="de-CH"/>
-              </w:rPr>
-            </w:pPr>
-            <w:r>
-              <w:rPr>
-                <w:rFonts w:cs="Times New Roman"/>
-                <w:sz w:val="22"/>
-                <w:szCs w:val="22"/>
-                <w:lang w:val="de-CH"/>
-              </w:rPr>
-              <w:t>Welche Verbesserungen würden Sie vorschlagen</w:t>
-            </w:r>
-            <w:r>
-              <w:rPr>
-                <w:rFonts w:cs="Times New Roman"/>
-                <w:sz w:val="22"/>
-                <w:szCs w:val="22"/>
-                <w:lang w:val="de-CH"/>
-              </w:rPr>
-              <w:t>?</w:t>
-            </w:r>
-          </w:p>
-        </w:tc>
-        <w:tc>
-          <w:tcPr>
-            <w:tcW w:w="4677" w:type="dxa"/>
+                <w:rFonts w:cs="Times New Roman"/>
+                <w:sz w:val="22"/>
+                <w:szCs w:val="22"/>
+                <w:lang w:val="de-CH"/>
+              </w:rPr>
+            </w:pPr>
+            <w:r>
+              <w:rPr>
+                <w:rFonts w:cs="Times New Roman"/>
+                <w:sz w:val="22"/>
+                <w:szCs w:val="22"/>
+                <w:lang w:val="de-CH"/>
+              </w:rPr>
+              <w:t>Welche Verbesserungen würden Sie vorschlagen?</w:t>
+            </w:r>
+          </w:p>
+        </w:tc>
+        <w:tc>
+          <w:tcPr>
+            <w:tcW w:w="4676" w:type="dxa"/>
           </w:tcPr>
           <w:p>
             <w:pPr>

</xml_diff>